<commit_message>
Fix AI_EXTRACT response path: confirmed live, nested under "response"
Verified against the real account: AI_EXTRACT returns
{"error": null, "response": {"brand": ..., "model_number": ...}},
not a flat top-level object as originally assumed. Updated the SQL,
beginner_guide.md, and regenerated beginner_guide.docx to match.
</commit_message>
<xml_diff>
--- a/docs/beginner_guide.docx
+++ b/docs/beginner_guide.docx
@@ -5057,68 +5057,48 @@
     <w:p>
       <w:r>
         <w:rPr>
+          <w:b/>
+        </w:rPr>
+        <w:t>Confirmed live (Sept 2026):</w:t>
+      </w:r>
+      <w:r>
+        <w:rPr>
           <w:b w:val="0"/>
         </w:rPr>
-        <w:t xml:space="preserve">It should look like </w:t>
+        <w:t xml:space="preserve"> the real shape is nested one level under </w:t>
       </w:r>
       <w:r>
         <w:rPr>
           <w:rFonts w:ascii="Consolas" w:hAnsi="Consolas"/>
           <w:sz w:val="20"/>
         </w:rPr>
-        <w:t>{"brand": "Sony", "model_number": "PSLX350H"}</w:t>
+        <w:t>response</w:t>
       </w:r>
       <w:r>
         <w:rPr>
           <w:b w:val="0"/>
         </w:rPr>
-        <w:t xml:space="preserve">. If it's nested differently (e.g. </w:t>
+        <w:t xml:space="preserve">, e.g. </w:t>
       </w:r>
       <w:r>
         <w:rPr>
           <w:rFonts w:ascii="Consolas" w:hAnsi="Consolas"/>
           <w:sz w:val="20"/>
         </w:rPr>
-        <w:t>{"response": {...}}</w:t>
+        <w:t>{"error": null, "response": {"brand": "Bose", "model_number": "AM53BK"}}</w:t>
       </w:r>
       <w:r>
         <w:rPr>
           <w:b w:val="0"/>
         </w:rPr>
-        <w:t xml:space="preserve">), tell me and we'll adjust the next block's </w:t>
-      </w:r>
-      <w:r>
-        <w:rPr>
-          <w:rFonts w:ascii="Consolas" w:hAnsi="Consolas"/>
-          <w:sz w:val="20"/>
-        </w:rPr>
-        <w:t>:brand</w:t>
-      </w:r>
+        <w:t xml:space="preserve"> — NOT a flat top-level object. The block below already reflects this.</w:t>
+      </w:r>
+    </w:p>
+    <w:p>
       <w:r>
         <w:rPr>
           <w:b w:val="0"/>
         </w:rPr>
-        <w:t>/</w:t>
-      </w:r>
-      <w:r>
-        <w:rPr>
-          <w:rFonts w:ascii="Consolas" w:hAnsi="Consolas"/>
-          <w:sz w:val="20"/>
-        </w:rPr>
-        <w:t>:model_number</w:t>
-      </w:r>
-      <w:r>
-        <w:rPr>
-          <w:b w:val="0"/>
-        </w:rPr>
-        <w:t xml:space="preserve"> paths.</w:t>
-      </w:r>
-    </w:p>
-    <w:p>
-      <w:r>
-        <w:rPr>
-          <w:b w:val="0"/>
-        </w:rPr>
         <w:t>Then continue:</w:t>
       </w:r>
     </w:p>
@@ -5145,7 +5125,7 @@
           <w:rFonts w:ascii="Consolas" w:hAnsi="Consolas"/>
           <w:sz w:val="18"/>
         </w:rPr>
-        <w:t>SELECT id, UPPER(TRIM(extracted:brand::VARCHAR)) AS brand, UPPER(TRIM(extracted:model_number::VARCHAR)) AS model_number</w:t>
+        <w:t>SELECT id, UPPER(TRIM(extracted:response:brand::VARCHAR)) AS brand, UPPER(TRIM(extracted:response:model_number::VARCHAR)) AS model_number</w:t>
       </w:r>
     </w:p>
     <w:p>
@@ -5197,7 +5177,7 @@
           <w:rFonts w:ascii="Consolas" w:hAnsi="Consolas"/>
           <w:sz w:val="18"/>
         </w:rPr>
-        <w:t>SELECT id, UPPER(TRIM(extracted:brand::VARCHAR)) AS brand, UPPER(TRIM(extracted:model_number::VARCHAR)) AS model_number</w:t>
+        <w:t>SELECT id, UPPER(TRIM(extracted:response:brand::VARCHAR)) AS brand, UPPER(TRIM(extracted:response:model_number::VARCHAR)) AS model_number</w:t>
       </w:r>
     </w:p>
     <w:p>

</xml_diff>

<commit_message>
Fix AI_EXTRACT placeholder-text bug: normalize NONE/N-A/etc to real NULL
Confirmed live: model_number frequently came back as the literal string
"NONE" instead of empty, which would have let unrelated pairs falsely
score a perfect attribute-similarity match. Same fix applied to brand
for consistency. Updated SQL + both guide formats.
</commit_message>
<xml_diff>
--- a/docs/beginner_guide.docx
+++ b/docs/beginner_guide.docx
@@ -5097,8 +5097,87 @@
     <w:p>
       <w:r>
         <w:rPr>
+          <w:b/>
+        </w:rPr>
+        <w:t>Second confirmed live bug:</w:t>
+      </w:r>
+      <w:r>
+        <w:rPr>
           <w:b w:val="0"/>
         </w:rPr>
+        <w:t xml:space="preserve"> despite the prompt saying "reply ... or empty if none is present," the model sometimes writes the literal word </w:t>
+      </w:r>
+      <w:r>
+        <w:rPr>
+          <w:rFonts w:ascii="Consolas" w:hAnsi="Consolas"/>
+          <w:sz w:val="20"/>
+        </w:rPr>
+        <w:t>NONE</w:t>
+      </w:r>
+      <w:r>
+        <w:rPr>
+          <w:b w:val="0"/>
+        </w:rPr>
+        <w:t xml:space="preserve"> instead of an actual empty string (verified: </w:t>
+      </w:r>
+      <w:r>
+        <w:rPr>
+          <w:rFonts w:ascii="Consolas" w:hAnsi="Consolas"/>
+          <w:sz w:val="20"/>
+        </w:rPr>
+        <w:t>NONE</w:t>
+      </w:r>
+      <w:r>
+        <w:rPr>
+          <w:b w:val="0"/>
+        </w:rPr>
+        <w:t xml:space="preserve"> showed up as a frequent </w:t>
+      </w:r>
+      <w:r>
+        <w:rPr>
+          <w:rFonts w:ascii="Consolas" w:hAnsi="Consolas"/>
+          <w:sz w:val="20"/>
+        </w:rPr>
+        <w:t>model_number</w:t>
+      </w:r>
+      <w:r>
+        <w:rPr>
+          <w:b w:val="0"/>
+        </w:rPr>
+        <w:t xml:space="preserve"> value). Left unhandled, two unrelated products both extracted as </w:t>
+      </w:r>
+      <w:r>
+        <w:rPr>
+          <w:rFonts w:ascii="Consolas" w:hAnsi="Consolas"/>
+          <w:sz w:val="20"/>
+        </w:rPr>
+        <w:t>model_number='NONE'</w:t>
+      </w:r>
+      <w:r>
+        <w:rPr>
+          <w:b w:val="0"/>
+        </w:rPr>
+        <w:t xml:space="preserve"> would score a *perfect* string-similarity match — silently inflating </w:t>
+      </w:r>
+      <w:r>
+        <w:rPr>
+          <w:rFonts w:ascii="Consolas" w:hAnsi="Consolas"/>
+          <w:sz w:val="20"/>
+        </w:rPr>
+        <w:t>attr_sim</w:t>
+      </w:r>
+      <w:r>
+        <w:rPr>
+          <w:b w:val="0"/>
+        </w:rPr>
+        <w:t xml:space="preserve"> for pairs with zero real evidence. The block below normalizes known placeholder words to true NULL before that can happen.</w:t>
+      </w:r>
+    </w:p>
+    <w:p>
+      <w:r>
+        <w:rPr>
+          <w:b w:val="0"/>
+        </w:rPr>
         <w:t>Then continue:</w:t>
       </w:r>
     </w:p>
@@ -5125,7 +5204,72 @@
           <w:rFonts w:ascii="Consolas" w:hAnsi="Consolas"/>
           <w:sz w:val="18"/>
         </w:rPr>
-        <w:t>SELECT id, UPPER(TRIM(extracted:response:brand::VARCHAR)) AS brand, UPPER(TRIM(extracted:response:model_number::VARCHAR)) AS model_number</w:t>
+        <w:t>SELECT</w:t>
+      </w:r>
+    </w:p>
+    <w:p>
+      <w:pPr>
+        <w:spacing w:before="0" w:after="0"/>
+        <w:shd w:val="clear" w:color="auto" w:fill="EFEFEF"/>
+      </w:pPr>
+      <w:r>
+        <w:rPr>
+          <w:rFonts w:ascii="Consolas" w:hAnsi="Consolas"/>
+          <w:sz w:val="18"/>
+        </w:rPr>
+        <w:t xml:space="preserve">  id,</w:t>
+      </w:r>
+    </w:p>
+    <w:p>
+      <w:pPr>
+        <w:spacing w:before="0" w:after="0"/>
+        <w:shd w:val="clear" w:color="auto" w:fill="EFEFEF"/>
+      </w:pPr>
+      <w:r>
+        <w:rPr>
+          <w:rFonts w:ascii="Consolas" w:hAnsi="Consolas"/>
+          <w:sz w:val="18"/>
+        </w:rPr>
+        <w:t xml:space="preserve">  CASE WHEN UPPER(TRIM(extracted:response:brand::VARCHAR)) IN ('', 'NONE', 'N/A', 'NA', 'NULL', 'EMPTY', 'UNKNOWN', 'UNCLEAR') THEN NULL</w:t>
+      </w:r>
+    </w:p>
+    <w:p>
+      <w:pPr>
+        <w:spacing w:before="0" w:after="0"/>
+        <w:shd w:val="clear" w:color="auto" w:fill="EFEFEF"/>
+      </w:pPr>
+      <w:r>
+        <w:rPr>
+          <w:rFonts w:ascii="Consolas" w:hAnsi="Consolas"/>
+          <w:sz w:val="18"/>
+        </w:rPr>
+        <w:t xml:space="preserve">       ELSE UPPER(TRIM(extracted:response:brand::VARCHAR)) END AS brand,</w:t>
+      </w:r>
+    </w:p>
+    <w:p>
+      <w:pPr>
+        <w:spacing w:before="0" w:after="0"/>
+        <w:shd w:val="clear" w:color="auto" w:fill="EFEFEF"/>
+      </w:pPr>
+      <w:r>
+        <w:rPr>
+          <w:rFonts w:ascii="Consolas" w:hAnsi="Consolas"/>
+          <w:sz w:val="18"/>
+        </w:rPr>
+        <w:t xml:space="preserve">  CASE WHEN UPPER(TRIM(extracted:response:model_number::VARCHAR)) IN ('', 'NONE', 'N/A', 'NA', 'NULL', 'EMPTY', 'UNKNOWN', 'UNCLEAR') THEN NULL</w:t>
+      </w:r>
+    </w:p>
+    <w:p>
+      <w:pPr>
+        <w:spacing w:before="0" w:after="0"/>
+        <w:shd w:val="clear" w:color="auto" w:fill="EFEFEF"/>
+      </w:pPr>
+      <w:r>
+        <w:rPr>
+          <w:rFonts w:ascii="Consolas" w:hAnsi="Consolas"/>
+          <w:sz w:val="18"/>
+        </w:rPr>
+        <w:t xml:space="preserve">       ELSE UPPER(TRIM(extracted:response:model_number::VARCHAR)) END AS model_number</w:t>
       </w:r>
     </w:p>
     <w:p>
@@ -5177,7 +5321,72 @@
           <w:rFonts w:ascii="Consolas" w:hAnsi="Consolas"/>
           <w:sz w:val="18"/>
         </w:rPr>
-        <w:t>SELECT id, UPPER(TRIM(extracted:response:brand::VARCHAR)) AS brand, UPPER(TRIM(extracted:response:model_number::VARCHAR)) AS model_number</w:t>
+        <w:t>SELECT</w:t>
+      </w:r>
+    </w:p>
+    <w:p>
+      <w:pPr>
+        <w:spacing w:before="0" w:after="0"/>
+        <w:shd w:val="clear" w:color="auto" w:fill="EFEFEF"/>
+      </w:pPr>
+      <w:r>
+        <w:rPr>
+          <w:rFonts w:ascii="Consolas" w:hAnsi="Consolas"/>
+          <w:sz w:val="18"/>
+        </w:rPr>
+        <w:t xml:space="preserve">  id,</w:t>
+      </w:r>
+    </w:p>
+    <w:p>
+      <w:pPr>
+        <w:spacing w:before="0" w:after="0"/>
+        <w:shd w:val="clear" w:color="auto" w:fill="EFEFEF"/>
+      </w:pPr>
+      <w:r>
+        <w:rPr>
+          <w:rFonts w:ascii="Consolas" w:hAnsi="Consolas"/>
+          <w:sz w:val="18"/>
+        </w:rPr>
+        <w:t xml:space="preserve">  CASE WHEN UPPER(TRIM(extracted:response:brand::VARCHAR)) IN ('', 'NONE', 'N/A', 'NA', 'NULL', 'EMPTY', 'UNKNOWN', 'UNCLEAR') THEN NULL</w:t>
+      </w:r>
+    </w:p>
+    <w:p>
+      <w:pPr>
+        <w:spacing w:before="0" w:after="0"/>
+        <w:shd w:val="clear" w:color="auto" w:fill="EFEFEF"/>
+      </w:pPr>
+      <w:r>
+        <w:rPr>
+          <w:rFonts w:ascii="Consolas" w:hAnsi="Consolas"/>
+          <w:sz w:val="18"/>
+        </w:rPr>
+        <w:t xml:space="preserve">       ELSE UPPER(TRIM(extracted:response:brand::VARCHAR)) END AS brand,</w:t>
+      </w:r>
+    </w:p>
+    <w:p>
+      <w:pPr>
+        <w:spacing w:before="0" w:after="0"/>
+        <w:shd w:val="clear" w:color="auto" w:fill="EFEFEF"/>
+      </w:pPr>
+      <w:r>
+        <w:rPr>
+          <w:rFonts w:ascii="Consolas" w:hAnsi="Consolas"/>
+          <w:sz w:val="18"/>
+        </w:rPr>
+        <w:t xml:space="preserve">  CASE WHEN UPPER(TRIM(extracted:response:model_number::VARCHAR)) IN ('', 'NONE', 'N/A', 'NA', 'NULL', 'EMPTY', 'UNKNOWN', 'UNCLEAR') THEN NULL</w:t>
+      </w:r>
+    </w:p>
+    <w:p>
+      <w:pPr>
+        <w:spacing w:before="0" w:after="0"/>
+        <w:shd w:val="clear" w:color="auto" w:fill="EFEFEF"/>
+      </w:pPr>
+      <w:r>
+        <w:rPr>
+          <w:rFonts w:ascii="Consolas" w:hAnsi="Consolas"/>
+          <w:sz w:val="18"/>
+        </w:rPr>
+        <w:t xml:space="preserve">       ELSE UPPER(TRIM(extracted:response:model_number::VARCHAR)) END AS model_number</w:t>
       </w:r>
     </w:p>
     <w:p>

</xml_diff>

<commit_message>
Calibrate AUTO_ACCEPT/AUTO_REJECT thresholds against real ground truth
Original guess (0.80/0.30) inverted the design intent: 86% of pairs
landed in GRAY_ZONE, and AUTO_ACCEPT at that level was only ~75%
precise on its own (no LLM check), silently baking in false positives
from same-brand product variants. Grid-checked against
abt_buy_perfectMapping.csv; 0.50/0.90 gives 98.4% accept precision,
1.2% recall loss on reject, and cuts GRAY_ZONE from 70,000 to ~20,400
pairs (71% fewer AI calls needed). Updated SQL + both guide formats,
plus an optional re-tuning query for future runs.
</commit_message>
<xml_diff>
--- a/docs/beginner_guide.docx
+++ b/docs/beginner_guide.docx
@@ -5755,6 +5755,72 @@
       </w:r>
     </w:p>
     <w:p>
+      <w:r>
+        <w:rPr>
+          <w:b/>
+        </w:rPr>
+        <w:t>These thresholds are empirically calibrated (Sept 2026, live run), not guessed.</w:t>
+      </w:r>
+      <w:r>
+        <w:rPr>
+          <w:b w:val="0"/>
+        </w:rPr>
+        <w:t xml:space="preserve"> A first pass at 0.80/0.30 put 86% of all pairs into </w:t>
+      </w:r>
+      <w:r>
+        <w:rPr>
+          <w:rFonts w:ascii="Consolas" w:hAnsi="Consolas"/>
+          <w:sz w:val="20"/>
+        </w:rPr>
+        <w:t>GRAY_ZONE</w:t>
+      </w:r>
+      <w:r>
+        <w:rPr>
+          <w:b w:val="0"/>
+        </w:rPr>
+        <w:t xml:space="preserve"> (inverted from the design intent), and testing showed </w:t>
+      </w:r>
+      <w:r>
+        <w:rPr>
+          <w:rFonts w:ascii="Consolas" w:hAnsi="Consolas"/>
+          <w:sz w:val="20"/>
+        </w:rPr>
+        <w:t>AUTO_ACCEPT</w:t>
+      </w:r>
+      <w:r>
+        <w:rPr>
+          <w:b w:val="0"/>
+        </w:rPr>
+        <w:t xml:space="preserve"> at that level was only ~75% precise on its own (same-brand product variants score deceptively high on embedding/attribute similarity alone, with no LLM check to catch it). Grid-checking a few threshold pairs against the real ground truth (see the appendix note below if you want to re-run this check yourself) found </w:t>
+      </w:r>
+      <w:r>
+        <w:rPr>
+          <w:rFonts w:ascii="Consolas" w:hAnsi="Consolas"/>
+          <w:sz w:val="20"/>
+        </w:rPr>
+        <w:t>0.50</w:t>
+      </w:r>
+      <w:r>
+        <w:rPr>
+          <w:b w:val="0"/>
+        </w:rPr>
+        <w:t>/</w:t>
+      </w:r>
+      <w:r>
+        <w:rPr>
+          <w:rFonts w:ascii="Consolas" w:hAnsi="Consolas"/>
+          <w:sz w:val="20"/>
+        </w:rPr>
+        <w:t>0.90</w:t>
+      </w:r>
+      <w:r>
+        <w:rPr>
+          <w:b w:val="0"/>
+        </w:rPr>
+        <w:t xml:space="preserve"> as the best tradeoff: only 1.2% of true matches lost to auto-reject, 98.4% precision in auto-accept, and the gray zone cut from 70,000 to ~20,400 pairs (71% fewer AI calls needed).</w:t>
+      </w:r>
+    </w:p>
+    <w:p>
       <w:pPr>
         <w:spacing w:before="0" w:after="0"/>
         <w:shd w:val="clear" w:color="auto" w:fill="EFEFEF"/>
@@ -5790,20 +5856,20 @@
           <w:rFonts w:ascii="Consolas" w:hAnsi="Consolas"/>
           <w:sz w:val="18"/>
         </w:rPr>
-        <w:t>SET AUTO_ACCEPT_THRESHOLD = 0.80;</w:t>
-      </w:r>
-    </w:p>
-    <w:p>
-      <w:pPr>
-        <w:spacing w:before="0" w:after="0"/>
-        <w:shd w:val="clear" w:color="auto" w:fill="EFEFEF"/>
-      </w:pPr>
-      <w:r>
-        <w:rPr>
-          <w:rFonts w:ascii="Consolas" w:hAnsi="Consolas"/>
-          <w:sz w:val="18"/>
-        </w:rPr>
-        <w:t>SET AUTO_REJECT_THRESHOLD = 0.30;</w:t>
+        <w:t>SET AUTO_ACCEPT_THRESHOLD = 0.90;</w:t>
+      </w:r>
+    </w:p>
+    <w:p>
+      <w:pPr>
+        <w:spacing w:before="0" w:after="0"/>
+        <w:shd w:val="clear" w:color="auto" w:fill="EFEFEF"/>
+      </w:pPr>
+      <w:r>
+        <w:rPr>
+          <w:rFonts w:ascii="Consolas" w:hAnsi="Consolas"/>
+          <w:sz w:val="18"/>
+        </w:rPr>
+        <w:t>SET AUTO_REJECT_THRESHOLD = 0.50;</w:t>
       </w:r>
     </w:p>
     <w:p>
@@ -6472,27 +6538,152 @@
         <w:rPr>
           <w:b w:val="0"/>
         </w:rPr>
-        <w:t xml:space="preserve"> the </w:t>
+        <w:t xml:space="preserve"> with the calibrated thresholds above, </w:t>
       </w:r>
       <w:r>
         <w:rPr>
           <w:rFonts w:ascii="Consolas" w:hAnsi="Consolas"/>
           <w:sz w:val="20"/>
         </w:rPr>
-        <w:t>band</w:t>
+        <w:t>GRAY_ZONE</w:t>
       </w:r>
       <w:r>
         <w:rPr>
           <w:b w:val="0"/>
         </w:rPr>
-        <w:t xml:space="preserve"> breakdown shows most pairs as </w:t>
+        <w:t xml:space="preserve"> should be around 20,400 (not 70,000 — that inverted result is what a naive un-calibrated guess produces, see the note above). If your numbers come out very different from this, something upstream (blocking, embeddings, or attribute extraction) likely diverged from what's expected in this dataset — ask before proceeding.</w:t>
+      </w:r>
+    </w:p>
+    <w:p>
+      <w:r>
+        <w:rPr>
+          <w:b/>
+        </w:rPr>
+        <w:t>Optional — how to re-verify/re-tune these thresholds yourself against ground truth:</w:t>
+      </w:r>
+    </w:p>
+    <w:p>
+      <w:pPr>
+        <w:spacing w:before="0" w:after="0"/>
+        <w:shd w:val="clear" w:color="auto" w:fill="EFEFEF"/>
+      </w:pPr>
+      <w:r>
+        <w:rPr>
+          <w:rFonts w:ascii="Consolas" w:hAnsi="Consolas"/>
+          <w:sz w:val="18"/>
+        </w:rPr>
+        <w:t>SELECT</w:t>
+      </w:r>
+    </w:p>
+    <w:p>
+      <w:pPr>
+        <w:spacing w:before="0" w:after="0"/>
+        <w:shd w:val="clear" w:color="auto" w:fill="EFEFEF"/>
+      </w:pPr>
+      <w:r>
+        <w:rPr>
+          <w:rFonts w:ascii="Consolas" w:hAnsi="Consolas"/>
+          <w:sz w:val="18"/>
+        </w:rPr>
+        <w:t xml:space="preserve">  SUM(CASE WHEN gt.id_abt IS NOT NULL AND b.pre_score &lt; 0.50 THEN 1 ELSE 0 END) AS true_matches_lost_to_reject,</w:t>
+      </w:r>
+    </w:p>
+    <w:p>
+      <w:pPr>
+        <w:spacing w:before="0" w:after="0"/>
+        <w:shd w:val="clear" w:color="auto" w:fill="EFEFEF"/>
+      </w:pPr>
+      <w:r>
+        <w:rPr>
+          <w:rFonts w:ascii="Consolas" w:hAnsi="Consolas"/>
+          <w:sz w:val="18"/>
+        </w:rPr>
+        <w:t xml:space="preserve">  SUM(CASE WHEN gt.id_abt IS NULL AND b.pre_score &gt;= 0.90 THEN 1 ELSE 0 END) AS false_positives_in_accept,</w:t>
+      </w:r>
+    </w:p>
+    <w:p>
+      <w:pPr>
+        <w:spacing w:before="0" w:after="0"/>
+        <w:shd w:val="clear" w:color="auto" w:fill="EFEFEF"/>
+      </w:pPr>
+      <w:r>
+        <w:rPr>
+          <w:rFonts w:ascii="Consolas" w:hAnsi="Consolas"/>
+          <w:sz w:val="18"/>
+        </w:rPr>
+        <w:t xml:space="preserve">  SUM(CASE WHEN b.pre_score &lt; 0.50 THEN 1 ELSE 0 END) AS reject_total,</w:t>
+      </w:r>
+    </w:p>
+    <w:p>
+      <w:pPr>
+        <w:spacing w:before="0" w:after="0"/>
+        <w:shd w:val="clear" w:color="auto" w:fill="EFEFEF"/>
+      </w:pPr>
+      <w:r>
+        <w:rPr>
+          <w:rFonts w:ascii="Consolas" w:hAnsi="Consolas"/>
+          <w:sz w:val="18"/>
+        </w:rPr>
+        <w:t xml:space="preserve">  SUM(CASE WHEN b.pre_score &gt;= 0.90 THEN 1 ELSE 0 END) AS accept_total,</w:t>
+      </w:r>
+    </w:p>
+    <w:p>
+      <w:pPr>
+        <w:spacing w:before="0" w:after="0"/>
+        <w:shd w:val="clear" w:color="auto" w:fill="EFEFEF"/>
+      </w:pPr>
+      <w:r>
+        <w:rPr>
+          <w:rFonts w:ascii="Consolas" w:hAnsi="Consolas"/>
+          <w:sz w:val="18"/>
+        </w:rPr>
+        <w:t xml:space="preserve">  COUNT(*) - SUM(CASE WHEN b.pre_score &lt; 0.50 THEN 1 ELSE 0 END) - SUM(CASE WHEN b.pre_score &gt;= 0.90 THEN 1 ELSE 0 END) AS gray_zone_total</w:t>
+      </w:r>
+    </w:p>
+    <w:p>
+      <w:pPr>
+        <w:spacing w:before="0" w:after="0"/>
+        <w:shd w:val="clear" w:color="auto" w:fill="EFEFEF"/>
+      </w:pPr>
+      <w:r>
+        <w:rPr>
+          <w:rFonts w:ascii="Consolas" w:hAnsi="Consolas"/>
+          <w:sz w:val="18"/>
+        </w:rPr>
+        <w:t>FROM CANDIDATE_PAIRS_BANDED b</w:t>
+      </w:r>
+    </w:p>
+    <w:p>
+      <w:pPr>
+        <w:spacing w:before="0" w:after="0"/>
+        <w:shd w:val="clear" w:color="auto" w:fill="EFEFEF"/>
+      </w:pPr>
+      <w:r>
+        <w:rPr>
+          <w:rFonts w:ascii="Consolas" w:hAnsi="Consolas"/>
+          <w:sz w:val="18"/>
+        </w:rPr>
+        <w:t>LEFT JOIN GROUND_TRUTH_RAW gt ON gt.id_abt = b.abt_id AND gt.id_buy = b.buy_id;</w:t>
+      </w:r>
+    </w:p>
+    <w:p>
+      <w:pPr>
+        <w:spacing w:before="0" w:after="120"/>
+      </w:pPr>
+    </w:p>
+    <w:p>
+      <w:r>
+        <w:rPr>
+          <w:b w:val="0"/>
+        </w:rPr>
+        <w:t xml:space="preserve">Swap the </w:t>
       </w:r>
       <w:r>
         <w:rPr>
           <w:rFonts w:ascii="Consolas" w:hAnsi="Consolas"/>
           <w:sz w:val="20"/>
         </w:rPr>
-        <w:t>AUTO_ACCEPT</w:t>
+        <w:t>0.50</w:t>
       </w:r>
       <w:r>
         <w:rPr>
@@ -6505,38 +6696,65 @@
           <w:rFonts w:ascii="Consolas" w:hAnsi="Consolas"/>
           <w:sz w:val="20"/>
         </w:rPr>
-        <w:t>AUTO_REJECT</w:t>
+        <w:t>0.90</w:t>
       </w:r>
       <w:r>
         <w:rPr>
           <w:b w:val="0"/>
         </w:rPr>
-        <w:t xml:space="preserve">, with </w:t>
+        <w:t xml:space="preserve"> literals to try other threshold pairs; watch </w:t>
       </w:r>
       <w:r>
         <w:rPr>
           <w:rFonts w:ascii="Consolas" w:hAnsi="Consolas"/>
           <w:sz w:val="20"/>
         </w:rPr>
-        <w:t>GRAY_ZONE</w:t>
+        <w:t>true_matches_lost_to_reject</w:t>
       </w:r>
       <w:r>
         <w:rPr>
           <w:b w:val="0"/>
         </w:rPr>
-        <w:t xml:space="preserve"> a smaller minority (that minority is all that spends real LLM budget). </w:t>
-      </w:r>
-      <w:r>
-        <w:rPr>
-          <w:b/>
-        </w:rPr>
-        <w:t>If `GRAY_ZONE` is tens of thousands, tell me</w:t>
+        <w:t xml:space="preserve"> and </w:t>
+      </w:r>
+      <w:r>
+        <w:rPr>
+          <w:rFonts w:ascii="Consolas" w:hAnsi="Consolas"/>
+          <w:sz w:val="20"/>
+        </w:rPr>
+        <w:t>false_positives_in_accept</w:t>
       </w:r>
       <w:r>
         <w:rPr>
           <w:b w:val="0"/>
         </w:rPr>
-        <w:t xml:space="preserve"> — we'd tighten the thresholds before this runs (cost control).</w:t>
+        <w:t xml:space="preserve"> — both should stay small relative to </w:t>
+      </w:r>
+      <w:r>
+        <w:rPr>
+          <w:rFonts w:ascii="Consolas" w:hAnsi="Consolas"/>
+          <w:sz w:val="20"/>
+        </w:rPr>
+        <w:t>reject_total</w:t>
+      </w:r>
+      <w:r>
+        <w:rPr>
+          <w:b w:val="0"/>
+        </w:rPr>
+        <w:t>/</w:t>
+      </w:r>
+      <w:r>
+        <w:rPr>
+          <w:rFonts w:ascii="Consolas" w:hAnsi="Consolas"/>
+          <w:sz w:val="20"/>
+        </w:rPr>
+        <w:t>accept_total</w:t>
+      </w:r>
+      <w:r>
+        <w:rPr>
+          <w:b w:val="0"/>
+        </w:rPr>
+        <w:t>.</w:t>
       </w:r>
     </w:p>
     <w:p>

</xml_diff>

<commit_message>
Fix NULL-propagation bug in AI_FILTER/AI_COMPLETE prompts
Confirmed live: ~34% of gray-zone pairs (6,930/20,414) returned
passed_gate = NULL instead of TRUE/FALSE, because ap.description/
bp.description being NULL made the concatenated prompt string NULL --
AI_FILTER then had nothing to evaluate. Same root cause existed in the
AI_COMPLETE adjudication prompt and in EXPLAIN_MATCH's prompt. Wrapped
every name/description reference in COALESCE(..., ''), matching the
discipline already used in the embeddings/attributes steps. Updated
sql/06_adjudication, agents/01_product_matching_agent.sql, and both
guide formats.
</commit_message>
<xml_diff>
--- a/docs/beginner_guide.docx
+++ b/docs/beginner_guide.docx
@@ -6051,6 +6051,71 @@
           <w:rFonts w:ascii="Consolas" w:hAnsi="Consolas"/>
           <w:sz w:val="18"/>
         </w:rPr>
+        <w:t>-- CONFIRMED live bug (Sept 2026): without a NULL guard, ~34% of gray-zone</w:t>
+      </w:r>
+    </w:p>
+    <w:p>
+      <w:pPr>
+        <w:spacing w:before="0" w:after="0"/>
+        <w:shd w:val="clear" w:color="auto" w:fill="EFEFEF"/>
+      </w:pPr>
+      <w:r>
+        <w:rPr>
+          <w:rFonts w:ascii="Consolas" w:hAnsi="Consolas"/>
+          <w:sz w:val="18"/>
+        </w:rPr>
+        <w:t>-- pairs (6,930 of 20,414) came back with passed_gate = NULL instead of</w:t>
+      </w:r>
+    </w:p>
+    <w:p>
+      <w:pPr>
+        <w:spacing w:before="0" w:after="0"/>
+        <w:shd w:val="clear" w:color="auto" w:fill="EFEFEF"/>
+      </w:pPr>
+      <w:r>
+        <w:rPr>
+          <w:rFonts w:ascii="Consolas" w:hAnsi="Consolas"/>
+          <w:sz w:val="18"/>
+        </w:rPr>
+        <w:t>-- TRUE/FALSE -- string concatenation with a NULL description field yields</w:t>
+      </w:r>
+    </w:p>
+    <w:p>
+      <w:pPr>
+        <w:spacing w:before="0" w:after="0"/>
+        <w:shd w:val="clear" w:color="auto" w:fill="EFEFEF"/>
+      </w:pPr>
+      <w:r>
+        <w:rPr>
+          <w:rFonts w:ascii="Consolas" w:hAnsi="Consolas"/>
+          <w:sz w:val="18"/>
+        </w:rPr>
+        <w:t>-- a NULL prompt, so AI_FILTER had nothing to evaluate. COALESCE fixes it,</w:t>
+      </w:r>
+    </w:p>
+    <w:p>
+      <w:pPr>
+        <w:spacing w:before="0" w:after="0"/>
+        <w:shd w:val="clear" w:color="auto" w:fill="EFEFEF"/>
+      </w:pPr>
+      <w:r>
+        <w:rPr>
+          <w:rFonts w:ascii="Consolas" w:hAnsi="Consolas"/>
+          <w:sz w:val="18"/>
+        </w:rPr>
+        <w:t>-- same discipline as Steps 4.3/4.4.</w:t>
+      </w:r>
+    </w:p>
+    <w:p>
+      <w:pPr>
+        <w:spacing w:before="0" w:after="0"/>
+        <w:shd w:val="clear" w:color="auto" w:fill="EFEFEF"/>
+      </w:pPr>
+      <w:r>
+        <w:rPr>
+          <w:rFonts w:ascii="Consolas" w:hAnsi="Consolas"/>
+          <w:sz w:val="18"/>
+        </w:rPr>
         <w:t>CREATE OR REPLACE TABLE GRAY_ZONE_GATED AS</w:t>
       </w:r>
     </w:p>
@@ -6103,7 +6168,7 @@
           <w:rFonts w:ascii="Consolas" w:hAnsi="Consolas"/>
           <w:sz w:val="18"/>
         </w:rPr>
-        <w:t xml:space="preserve">    ap.name, ap.description, bp.name, bp.description</w:t>
+        <w:t xml:space="preserve">    COALESCE(ap.name,''), COALESCE(ap.description,''), COALESCE(bp.name,''), COALESCE(bp.description,'')</w:t>
       </w:r>
     </w:p>
     <w:p>
@@ -6233,20 +6298,20 @@
           <w:rFonts w:ascii="Consolas" w:hAnsi="Consolas"/>
           <w:sz w:val="18"/>
         </w:rPr>
-        <w:t xml:space="preserve">  prompt =&gt; 'Product A: ' || ap.name || ' -- ' || ap.description ||</w:t>
-      </w:r>
-    </w:p>
-    <w:p>
-      <w:pPr>
-        <w:spacing w:before="0" w:after="0"/>
-        <w:shd w:val="clear" w:color="auto" w:fill="EFEFEF"/>
-      </w:pPr>
-      <w:r>
-        <w:rPr>
-          <w:rFonts w:ascii="Consolas" w:hAnsi="Consolas"/>
-          <w:sz w:val="18"/>
-        </w:rPr>
-        <w:t xml:space="preserve">            '\nProduct B: ' || bp.name || ' -- ' || bp.description ||</w:t>
+        <w:t xml:space="preserve">  prompt =&gt; 'Product A: ' || COALESCE(ap.name,'') || ' -- ' || COALESCE(ap.description,'') ||</w:t>
+      </w:r>
+    </w:p>
+    <w:p>
+      <w:pPr>
+        <w:spacing w:before="0" w:after="0"/>
+        <w:shd w:val="clear" w:color="auto" w:fill="EFEFEF"/>
+      </w:pPr>
+      <w:r>
+        <w:rPr>
+          <w:rFonts w:ascii="Consolas" w:hAnsi="Consolas"/>
+          <w:sz w:val="18"/>
+        </w:rPr>
+        <w:t xml:space="preserve">            '\nProduct B: ' || COALESCE(bp.name,'') || ' -- ' || COALESCE(bp.description,'') ||</w:t>
       </w:r>
     </w:p>
     <w:p>
@@ -10155,20 +10220,20 @@
           <w:rFonts w:ascii="Consolas" w:hAnsi="Consolas"/>
           <w:sz w:val="18"/>
         </w:rPr>
-        <w:t xml:space="preserve">    prompt =&gt; 'Product A (Abt): ' || ap.name || ' -- ' || ap.description ||</w:t>
-      </w:r>
-    </w:p>
-    <w:p>
-      <w:pPr>
-        <w:spacing w:before="0" w:after="0"/>
-        <w:shd w:val="clear" w:color="auto" w:fill="EFEFEF"/>
-      </w:pPr>
-      <w:r>
-        <w:rPr>
-          <w:rFonts w:ascii="Consolas" w:hAnsi="Consolas"/>
-          <w:sz w:val="18"/>
-        </w:rPr>
-        <w:t xml:space="preserve">              '\nProduct B (Buy): ' || bp.name || ' -- ' || bp.description ||</w:t>
+        <w:t xml:space="preserve">    prompt =&gt; 'Product A (Abt): ' || COALESCE(ap.name,'') || ' -- ' || COALESCE(ap.description,'') ||</w:t>
+      </w:r>
+    </w:p>
+    <w:p>
+      <w:pPr>
+        <w:spacing w:before="0" w:after="0"/>
+        <w:shd w:val="clear" w:color="auto" w:fill="EFEFEF"/>
+      </w:pPr>
+      <w:r>
+        <w:rPr>
+          <w:rFonts w:ascii="Consolas" w:hAnsi="Consolas"/>
+          <w:sz w:val="18"/>
+        </w:rPr>
+        <w:t xml:space="preserve">              '\nProduct B (Buy): ' || COALESCE(bp.name,'') || ' -- ' || COALESCE(bp.description,'') ||</w:t>
       </w:r>
     </w:p>
     <w:p>

</xml_diff>

<commit_message>
Replace deprecated mistral-large2 with confirmed-working claude-sonnet-5
Confirmed live (Sept 2026): mistral-large2, claude-4-sonnet, openai-gpt-4.1,
and snowflake-llama-3.3-70b all now error as "legacy state, please use
other models." Verified claude-sonnet-5 works via SHOW MODELS IN
SNOWFLAKE.MODELS plus a live test call. Updated the "capable model" role
everywhere it's used: GRAY_ZONE_ADJUDICATED, EXPLAIN_MATCH, and the
setup smoke test, across SQL files and both guide formats. Verified
mistral-7b (the "cheap model" tier, used by RECOMMEND_PRICE) still
works -- no change needed there.
</commit_message>
<xml_diff>
--- a/docs/beginner_guide.docx
+++ b/docs/beginner_guide.docx
@@ -6259,6 +6259,71 @@
           <w:rFonts w:ascii="Consolas" w:hAnsi="Consolas"/>
           <w:sz w:val="18"/>
         </w:rPr>
+        <w:t>-- CONFIRMED live (Sept 2026): mistral-large2/claude-4-sonnet/openai-gpt-4.1/</w:t>
+      </w:r>
+    </w:p>
+    <w:p>
+      <w:pPr>
+        <w:spacing w:before="0" w:after="0"/>
+        <w:shd w:val="clear" w:color="auto" w:fill="EFEFEF"/>
+      </w:pPr>
+      <w:r>
+        <w:rPr>
+          <w:rFonts w:ascii="Consolas" w:hAnsi="Consolas"/>
+          <w:sz w:val="18"/>
+        </w:rPr>
+        <w:t>-- snowflake-llama-3.3-70b are all deprecated ("legacy state, please use</w:t>
+      </w:r>
+    </w:p>
+    <w:p>
+      <w:pPr>
+        <w:spacing w:before="0" w:after="0"/>
+        <w:shd w:val="clear" w:color="auto" w:fill="EFEFEF"/>
+      </w:pPr>
+      <w:r>
+        <w:rPr>
+          <w:rFonts w:ascii="Consolas" w:hAnsi="Consolas"/>
+          <w:sz w:val="18"/>
+        </w:rPr>
+        <w:t>-- other models"). claude-sonnet-5 confirmed working via SHOW MODELS IN</w:t>
+      </w:r>
+    </w:p>
+    <w:p>
+      <w:pPr>
+        <w:spacing w:before="0" w:after="0"/>
+        <w:shd w:val="clear" w:color="auto" w:fill="EFEFEF"/>
+      </w:pPr>
+      <w:r>
+        <w:rPr>
+          <w:rFonts w:ascii="Consolas" w:hAnsi="Consolas"/>
+          <w:sz w:val="18"/>
+        </w:rPr>
+        <w:t>-- SNOWFLAKE.MODELS + a live test call -- model names churn fast on Cortex,</w:t>
+      </w:r>
+    </w:p>
+    <w:p>
+      <w:pPr>
+        <w:spacing w:before="0" w:after="0"/>
+        <w:shd w:val="clear" w:color="auto" w:fill="EFEFEF"/>
+      </w:pPr>
+      <w:r>
+        <w:rPr>
+          <w:rFonts w:ascii="Consolas" w:hAnsi="Consolas"/>
+          <w:sz w:val="18"/>
+        </w:rPr>
+        <w:t>-- re-verify with a trivial AI_COMPLETE call if it's been a while.</w:t>
+      </w:r>
+    </w:p>
+    <w:p>
+      <w:pPr>
+        <w:spacing w:before="0" w:after="0"/>
+        <w:shd w:val="clear" w:color="auto" w:fill="EFEFEF"/>
+      </w:pPr>
+      <w:r>
+        <w:rPr>
+          <w:rFonts w:ascii="Consolas" w:hAnsi="Consolas"/>
+          <w:sz w:val="18"/>
+        </w:rPr>
         <w:t>CREATE OR REPLACE TABLE GRAY_ZONE_ADJUDICATED AS</w:t>
       </w:r>
     </w:p>
@@ -6285,7 +6350,7 @@
           <w:rFonts w:ascii="Consolas" w:hAnsi="Consolas"/>
           <w:sz w:val="18"/>
         </w:rPr>
-        <w:t xml:space="preserve">  model =&gt; 'mistral-large2',</w:t>
+        <w:t xml:space="preserve">  model =&gt; 'claude-sonnet-5',</w:t>
       </w:r>
     </w:p>
     <w:p>
@@ -10194,6 +10259,32 @@
           <w:rFonts w:ascii="Consolas" w:hAnsi="Consolas"/>
           <w:sz w:val="18"/>
         </w:rPr>
+        <w:t xml:space="preserve">  -- claude-sonnet-5 confirmed working live (Sept 2026) -- mistral-large2</w:t>
+      </w:r>
+    </w:p>
+    <w:p>
+      <w:pPr>
+        <w:spacing w:before="0" w:after="0"/>
+        <w:shd w:val="clear" w:color="auto" w:fill="EFEFEF"/>
+      </w:pPr>
+      <w:r>
+        <w:rPr>
+          <w:rFonts w:ascii="Consolas" w:hAnsi="Consolas"/>
+          <w:sz w:val="18"/>
+        </w:rPr>
+        <w:t xml:space="preserve">  -- and several other older model names were found deprecated the same day.</w:t>
+      </w:r>
+    </w:p>
+    <w:p>
+      <w:pPr>
+        <w:spacing w:before="0" w:after="0"/>
+        <w:shd w:val="clear" w:color="auto" w:fill="EFEFEF"/>
+      </w:pPr>
+      <w:r>
+        <w:rPr>
+          <w:rFonts w:ascii="Consolas" w:hAnsi="Consolas"/>
+          <w:sz w:val="18"/>
+        </w:rPr>
         <w:t xml:space="preserve">  SELECT AI_COMPLETE(</w:t>
       </w:r>
     </w:p>
@@ -10207,7 +10298,7 @@
           <w:rFonts w:ascii="Consolas" w:hAnsi="Consolas"/>
           <w:sz w:val="18"/>
         </w:rPr>
-        <w:t xml:space="preserve">    model =&gt; 'mistral-large2',</w:t>
+        <w:t xml:space="preserve">    model =&gt; 'claude-sonnet-5',</w:t>
       </w:r>
     </w:p>
     <w:p>

</xml_diff>

<commit_message>
Add AI_COMPLETE null-verdict retry pass + fix misleading explanation text
Confirmed live: ~11.5% of gray-zone pairs that passed the AI_FILTER gate
(122 of 1061) got a NULL verdict back from AI_COMPLETE -- not traceable
to a specific text pattern, just an occasional real characteristic of
LLM calls at scale. Added a cheap retry UPDATE targeting only the null
subset. Also fixed 070's explanation text: pairs where a review was
attempted but never returned a usable verdict were being labeled "no
LLM review needed," which is factually wrong -- now says so honestly,
with the same safe pre_score fallback either way.
</commit_message>
<xml_diff>
--- a/docs/beginner_guide.docx
+++ b/docs/beginner_guide.docx
@@ -6519,6 +6519,331 @@
           <w:rFonts w:ascii="Consolas" w:hAnsi="Consolas"/>
           <w:sz w:val="18"/>
         </w:rPr>
+        <w:t>-- CONFIRMED live (Sept 2026): AI_COMPLETE returned a NULL verdict (no usable</w:t>
+      </w:r>
+    </w:p>
+    <w:p>
+      <w:pPr>
+        <w:spacing w:before="0" w:after="0"/>
+        <w:shd w:val="clear" w:color="auto" w:fill="EFEFEF"/>
+      </w:pPr>
+      <w:r>
+        <w:rPr>
+          <w:rFonts w:ascii="Consolas" w:hAnsi="Consolas"/>
+          <w:sz w:val="18"/>
+        </w:rPr>
+        <w:t>-- structured response) for ~11.5% of gray-zone pairs that passed the gate --</w:t>
+      </w:r>
+    </w:p>
+    <w:p>
+      <w:pPr>
+        <w:spacing w:before="0" w:after="0"/>
+        <w:shd w:val="clear" w:color="auto" w:fill="EFEFEF"/>
+      </w:pPr>
+      <w:r>
+        <w:rPr>
+          <w:rFonts w:ascii="Consolas" w:hAnsi="Consolas"/>
+          <w:sz w:val="18"/>
+        </w:rPr>
+        <w:t>-- not traceable to any single text pattern, just an occasional real</w:t>
+      </w:r>
+    </w:p>
+    <w:p>
+      <w:pPr>
+        <w:spacing w:before="0" w:after="0"/>
+        <w:shd w:val="clear" w:color="auto" w:fill="EFEFEF"/>
+      </w:pPr>
+      <w:r>
+        <w:rPr>
+          <w:rFonts w:ascii="Consolas" w:hAnsi="Consolas"/>
+          <w:sz w:val="18"/>
+        </w:rPr>
+        <w:t>-- characteristic of calling LLMs at scale. A cheap retry recovers most of them.</w:t>
+      </w:r>
+    </w:p>
+    <w:p>
+      <w:pPr>
+        <w:spacing w:before="0" w:after="0"/>
+        <w:shd w:val="clear" w:color="auto" w:fill="EFEFEF"/>
+      </w:pPr>
+      <w:r>
+        <w:rPr>
+          <w:rFonts w:ascii="Consolas" w:hAnsi="Consolas"/>
+          <w:sz w:val="18"/>
+        </w:rPr>
+        <w:t>UPDATE GRAY_ZONE_ADJUDICATED t</w:t>
+      </w:r>
+    </w:p>
+    <w:p>
+      <w:pPr>
+        <w:spacing w:before="0" w:after="0"/>
+        <w:shd w:val="clear" w:color="auto" w:fill="EFEFEF"/>
+      </w:pPr>
+      <w:r>
+        <w:rPr>
+          <w:rFonts w:ascii="Consolas" w:hAnsi="Consolas"/>
+          <w:sz w:val="18"/>
+        </w:rPr>
+        <w:t>SET verdict = retry.new_verdict</w:t>
+      </w:r>
+    </w:p>
+    <w:p>
+      <w:pPr>
+        <w:spacing w:before="0" w:after="0"/>
+        <w:shd w:val="clear" w:color="auto" w:fill="EFEFEF"/>
+      </w:pPr>
+      <w:r>
+        <w:rPr>
+          <w:rFonts w:ascii="Consolas" w:hAnsi="Consolas"/>
+          <w:sz w:val="18"/>
+        </w:rPr>
+        <w:t>FROM (</w:t>
+      </w:r>
+    </w:p>
+    <w:p>
+      <w:pPr>
+        <w:spacing w:before="0" w:after="0"/>
+        <w:shd w:val="clear" w:color="auto" w:fill="EFEFEF"/>
+      </w:pPr>
+      <w:r>
+        <w:rPr>
+          <w:rFonts w:ascii="Consolas" w:hAnsi="Consolas"/>
+          <w:sz w:val="18"/>
+        </w:rPr>
+        <w:t xml:space="preserve">  SELECT gza.abt_id, gza.buy_id, AI_COMPLETE(</w:t>
+      </w:r>
+    </w:p>
+    <w:p>
+      <w:pPr>
+        <w:spacing w:before="0" w:after="0"/>
+        <w:shd w:val="clear" w:color="auto" w:fill="EFEFEF"/>
+      </w:pPr>
+      <w:r>
+        <w:rPr>
+          <w:rFonts w:ascii="Consolas" w:hAnsi="Consolas"/>
+          <w:sz w:val="18"/>
+        </w:rPr>
+        <w:t xml:space="preserve">    model =&gt; 'claude-sonnet-5',</w:t>
+      </w:r>
+    </w:p>
+    <w:p>
+      <w:pPr>
+        <w:spacing w:before="0" w:after="0"/>
+        <w:shd w:val="clear" w:color="auto" w:fill="EFEFEF"/>
+      </w:pPr>
+      <w:r>
+        <w:rPr>
+          <w:rFonts w:ascii="Consolas" w:hAnsi="Consolas"/>
+          <w:sz w:val="18"/>
+        </w:rPr>
+        <w:t xml:space="preserve">    prompt =&gt; 'Product A: ' || COALESCE(ap.name,'') || ' -- ' || COALESCE(ap.description,'') ||</w:t>
+      </w:r>
+    </w:p>
+    <w:p>
+      <w:pPr>
+        <w:spacing w:before="0" w:after="0"/>
+        <w:shd w:val="clear" w:color="auto" w:fill="EFEFEF"/>
+      </w:pPr>
+      <w:r>
+        <w:rPr>
+          <w:rFonts w:ascii="Consolas" w:hAnsi="Consolas"/>
+          <w:sz w:val="18"/>
+        </w:rPr>
+        <w:t xml:space="preserve">              '\nProduct B: ' || COALESCE(bp.name,'') || ' -- ' || COALESCE(bp.description,'') ||</w:t>
+      </w:r>
+    </w:p>
+    <w:p>
+      <w:pPr>
+        <w:spacing w:before="0" w:after="0"/>
+        <w:shd w:val="clear" w:color="auto" w:fill="EFEFEF"/>
+      </w:pPr>
+      <w:r>
+        <w:rPr>
+          <w:rFonts w:ascii="Consolas" w:hAnsi="Consolas"/>
+          <w:sz w:val="18"/>
+        </w:rPr>
+        <w:t xml:space="preserve">              '\nDecide whether Product A and Product B are the exact same retail product listed by two different retailers. Consider brand, model number, and specs; ignore wording/formatting differences.',</w:t>
+      </w:r>
+    </w:p>
+    <w:p>
+      <w:pPr>
+        <w:spacing w:before="0" w:after="0"/>
+        <w:shd w:val="clear" w:color="auto" w:fill="EFEFEF"/>
+      </w:pPr>
+      <w:r>
+        <w:rPr>
+          <w:rFonts w:ascii="Consolas" w:hAnsi="Consolas"/>
+          <w:sz w:val="18"/>
+        </w:rPr>
+        <w:t xml:space="preserve">    response_format =&gt; { 'type': 'json', 'schema': { 'type': 'object', 'properties': {</w:t>
+      </w:r>
+    </w:p>
+    <w:p>
+      <w:pPr>
+        <w:spacing w:before="0" w:after="0"/>
+        <w:shd w:val="clear" w:color="auto" w:fill="EFEFEF"/>
+      </w:pPr>
+      <w:r>
+        <w:rPr>
+          <w:rFonts w:ascii="Consolas" w:hAnsi="Consolas"/>
+          <w:sz w:val="18"/>
+        </w:rPr>
+        <w:t xml:space="preserve">      'is_match': {'type': 'boolean'}, 'llm_confidence': {'type': 'number'}, 'rationale': {'type': 'string'}</w:t>
+      </w:r>
+    </w:p>
+    <w:p>
+      <w:pPr>
+        <w:spacing w:before="0" w:after="0"/>
+        <w:shd w:val="clear" w:color="auto" w:fill="EFEFEF"/>
+      </w:pPr>
+      <w:r>
+        <w:rPr>
+          <w:rFonts w:ascii="Consolas" w:hAnsi="Consolas"/>
+          <w:sz w:val="18"/>
+        </w:rPr>
+        <w:t xml:space="preserve">    }, 'required': ['is_match', 'llm_confidence', 'rationale'] } }</w:t>
+      </w:r>
+    </w:p>
+    <w:p>
+      <w:pPr>
+        <w:spacing w:before="0" w:after="0"/>
+        <w:shd w:val="clear" w:color="auto" w:fill="EFEFEF"/>
+      </w:pPr>
+      <w:r>
+        <w:rPr>
+          <w:rFonts w:ascii="Consolas" w:hAnsi="Consolas"/>
+          <w:sz w:val="18"/>
+        </w:rPr>
+        <w:t xml:space="preserve">  ) AS new_verdict</w:t>
+      </w:r>
+    </w:p>
+    <w:p>
+      <w:pPr>
+        <w:spacing w:before="0" w:after="0"/>
+        <w:shd w:val="clear" w:color="auto" w:fill="EFEFEF"/>
+      </w:pPr>
+      <w:r>
+        <w:rPr>
+          <w:rFonts w:ascii="Consolas" w:hAnsi="Consolas"/>
+          <w:sz w:val="18"/>
+        </w:rPr>
+        <w:t xml:space="preserve">  FROM GRAY_ZONE_ADJUDICATED gza</w:t>
+      </w:r>
+    </w:p>
+    <w:p>
+      <w:pPr>
+        <w:spacing w:before="0" w:after="0"/>
+        <w:shd w:val="clear" w:color="auto" w:fill="EFEFEF"/>
+      </w:pPr>
+      <w:r>
+        <w:rPr>
+          <w:rFonts w:ascii="Consolas" w:hAnsi="Consolas"/>
+          <w:sz w:val="18"/>
+        </w:rPr>
+        <w:t xml:space="preserve">  JOIN ABT_PRODUCTS ap ON ap.id = gza.abt_id</w:t>
+      </w:r>
+    </w:p>
+    <w:p>
+      <w:pPr>
+        <w:spacing w:before="0" w:after="0"/>
+        <w:shd w:val="clear" w:color="auto" w:fill="EFEFEF"/>
+      </w:pPr>
+      <w:r>
+        <w:rPr>
+          <w:rFonts w:ascii="Consolas" w:hAnsi="Consolas"/>
+          <w:sz w:val="18"/>
+        </w:rPr>
+        <w:t xml:space="preserve">  JOIN BUY_PRODUCTS bp ON bp.id = gza.buy_id</w:t>
+      </w:r>
+    </w:p>
+    <w:p>
+      <w:pPr>
+        <w:spacing w:before="0" w:after="0"/>
+        <w:shd w:val="clear" w:color="auto" w:fill="EFEFEF"/>
+      </w:pPr>
+      <w:r>
+        <w:rPr>
+          <w:rFonts w:ascii="Consolas" w:hAnsi="Consolas"/>
+          <w:sz w:val="18"/>
+        </w:rPr>
+        <w:t xml:space="preserve">  WHERE gza.verdict IS NULL</w:t>
+      </w:r>
+    </w:p>
+    <w:p>
+      <w:pPr>
+        <w:spacing w:before="0" w:after="0"/>
+        <w:shd w:val="clear" w:color="auto" w:fill="EFEFEF"/>
+      </w:pPr>
+      <w:r>
+        <w:rPr>
+          <w:rFonts w:ascii="Consolas" w:hAnsi="Consolas"/>
+          <w:sz w:val="18"/>
+        </w:rPr>
+        <w:t>) retry</w:t>
+      </w:r>
+    </w:p>
+    <w:p>
+      <w:pPr>
+        <w:spacing w:before="0" w:after="0"/>
+        <w:shd w:val="clear" w:color="auto" w:fill="EFEFEF"/>
+      </w:pPr>
+      <w:r>
+        <w:rPr>
+          <w:rFonts w:ascii="Consolas" w:hAnsi="Consolas"/>
+          <w:sz w:val="18"/>
+        </w:rPr>
+        <w:t>WHERE t.abt_id = retry.abt_id AND t.buy_id = retry.buy_id AND t.verdict IS NULL;</w:t>
+      </w:r>
+    </w:p>
+    <w:p>
+      <w:pPr>
+        <w:spacing w:before="0" w:after="0"/>
+        <w:shd w:val="clear" w:color="auto" w:fill="EFEFEF"/>
+      </w:pPr>
+      <w:r>
+        <w:rPr>
+          <w:rFonts w:ascii="Consolas" w:hAnsi="Consolas"/>
+          <w:sz w:val="18"/>
+        </w:rPr>
+        <w:t xml:space="preserve"> </w:t>
+      </w:r>
+    </w:p>
+    <w:p>
+      <w:pPr>
+        <w:spacing w:before="0" w:after="0"/>
+        <w:shd w:val="clear" w:color="auto" w:fill="EFEFEF"/>
+      </w:pPr>
+      <w:r>
+        <w:rPr>
+          <w:rFonts w:ascii="Consolas" w:hAnsi="Consolas"/>
+          <w:sz w:val="18"/>
+        </w:rPr>
+        <w:t>SELECT COUNT(*) AS still_null_after_retry FROM GRAY_ZONE_ADJUDICATED WHERE verdict IS NULL;</w:t>
+      </w:r>
+    </w:p>
+    <w:p>
+      <w:pPr>
+        <w:spacing w:before="0" w:after="0"/>
+        <w:shd w:val="clear" w:color="auto" w:fill="EFEFEF"/>
+      </w:pPr>
+      <w:r>
+        <w:rPr>
+          <w:rFonts w:ascii="Consolas" w:hAnsi="Consolas"/>
+          <w:sz w:val="18"/>
+        </w:rPr>
+        <w:t xml:space="preserve"> </w:t>
+      </w:r>
+    </w:p>
+    <w:p>
+      <w:pPr>
+        <w:spacing w:before="0" w:after="0"/>
+        <w:shd w:val="clear" w:color="auto" w:fill="EFEFEF"/>
+      </w:pPr>
+      <w:r>
+        <w:rPr>
+          <w:rFonts w:ascii="Consolas" w:hAnsi="Consolas"/>
+          <w:sz w:val="18"/>
+        </w:rPr>
         <w:t>CREATE OR REPLACE TABLE CANDIDATE_PAIRS_ADJUDICATED AS</w:t>
       </w:r>
     </w:p>
@@ -7074,6 +7399,71 @@
           <w:rFonts w:ascii="Consolas" w:hAnsi="Consolas"/>
           <w:sz w:val="18"/>
         </w:rPr>
+        <w:t xml:space="preserve">      -- Gray zone, passed the gate, but AI_COMPLETE still had no usable</w:t>
+      </w:r>
+    </w:p>
+    <w:p>
+      <w:pPr>
+        <w:spacing w:before="0" w:after="0"/>
+        <w:shd w:val="clear" w:color="auto" w:fill="EFEFEF"/>
+      </w:pPr>
+      <w:r>
+        <w:rPr>
+          <w:rFonts w:ascii="Consolas" w:hAnsi="Consolas"/>
+          <w:sz w:val="18"/>
+        </w:rPr>
+        <w:t xml:space="preserve">      -- verdict even after the retry above (~rare residual) -- same safe</w:t>
+      </w:r>
+    </w:p>
+    <w:p>
+      <w:pPr>
+        <w:spacing w:before="0" w:after="0"/>
+        <w:shd w:val="clear" w:color="auto" w:fill="EFEFEF"/>
+      </w:pPr>
+      <w:r>
+        <w:rPr>
+          <w:rFonts w:ascii="Consolas" w:hAnsi="Consolas"/>
+          <w:sz w:val="18"/>
+        </w:rPr>
+        <w:t xml:space="preserve">      -- fallback as AUTO_ACCEPT/AUTO_REJECT, but the explanation below says</w:t>
+      </w:r>
+    </w:p>
+    <w:p>
+      <w:pPr>
+        <w:spacing w:before="0" w:after="0"/>
+        <w:shd w:val="clear" w:color="auto" w:fill="EFEFEF"/>
+      </w:pPr>
+      <w:r>
+        <w:rPr>
+          <w:rFonts w:ascii="Consolas" w:hAnsi="Consolas"/>
+          <w:sz w:val="18"/>
+        </w:rPr>
+        <w:t xml:space="preserve">      -- so honestly instead of claiming "no review was needed."</w:t>
+      </w:r>
+    </w:p>
+    <w:p>
+      <w:pPr>
+        <w:spacing w:before="0" w:after="0"/>
+        <w:shd w:val="clear" w:color="auto" w:fill="EFEFEF"/>
+      </w:pPr>
+      <w:r>
+        <w:rPr>
+          <w:rFonts w:ascii="Consolas" w:hAnsi="Consolas"/>
+          <w:sz w:val="18"/>
+        </w:rPr>
+        <w:t xml:space="preserve">      WHEN band = 'GRAY_ZONE' AND passed_gate = TRUE AND llm_confidence IS NULL THEN pre_score</w:t>
+      </w:r>
+    </w:p>
+    <w:p>
+      <w:pPr>
+        <w:spacing w:before="0" w:after="0"/>
+        <w:shd w:val="clear" w:color="auto" w:fill="EFEFEF"/>
+      </w:pPr>
+      <w:r>
+        <w:rPr>
+          <w:rFonts w:ascii="Consolas" w:hAnsi="Consolas"/>
+          <w:sz w:val="18"/>
+        </w:rPr>
         <w:t xml:space="preserve">      ELSE pre_score</w:t>
       </w:r>
     </w:p>
@@ -7166,6 +7556,45 @@
           <w:sz w:val="18"/>
         </w:rPr>
         <w:t xml:space="preserve">        'embed=' || ROUND(embed_sim,3) || ' attr=' || ROUND(COALESCE(attr_sim,0),3) || ' -- fast filter gate said not-a-match'</w:t>
+      </w:r>
+    </w:p>
+    <w:p>
+      <w:pPr>
+        <w:spacing w:before="0" w:after="0"/>
+        <w:shd w:val="clear" w:color="auto" w:fill="EFEFEF"/>
+      </w:pPr>
+      <w:r>
+        <w:rPr>
+          <w:rFonts w:ascii="Consolas" w:hAnsi="Consolas"/>
+          <w:sz w:val="18"/>
+        </w:rPr>
+        <w:t xml:space="preserve">      WHEN band = 'GRAY_ZONE' AND passed_gate = TRUE AND llm_confidence IS NULL THEN</w:t>
+      </w:r>
+    </w:p>
+    <w:p>
+      <w:pPr>
+        <w:spacing w:before="0" w:after="0"/>
+        <w:shd w:val="clear" w:color="auto" w:fill="EFEFEF"/>
+      </w:pPr>
+      <w:r>
+        <w:rPr>
+          <w:rFonts w:ascii="Consolas" w:hAnsi="Consolas"/>
+          <w:sz w:val="18"/>
+        </w:rPr>
+        <w:t xml:space="preserve">        'embed=' || ROUND(embed_sim,3) || ' attr=' || ROUND(COALESCE(attr_sim,0),3)</w:t>
+      </w:r>
+    </w:p>
+    <w:p>
+      <w:pPr>
+        <w:spacing w:before="0" w:after="0"/>
+        <w:shd w:val="clear" w:color="auto" w:fill="EFEFEF"/>
+      </w:pPr>
+      <w:r>
+        <w:rPr>
+          <w:rFonts w:ascii="Consolas" w:hAnsi="Consolas"/>
+          <w:sz w:val="18"/>
+        </w:rPr>
+        <w:t xml:space="preserve">          || ' -- LLM review was attempted (passed the fast gate) but did not return a usable verdict, even after retry; falling back to embedding+attribute score only'</w:t>
       </w:r>
     </w:p>
     <w:p>

</xml_diff>

<commit_message>
Add explicit execution_environment to Cortex Analyst tool_resources
Confirmed live: Snowflake flagged all three agents' cortex_analyst_text_to_sql
tool (MatchAnalyst/PricingAnalyst/MarketAnalyst) as missing an explicit
execution_environment warehouse, needed to run the SQL Cortex Analyst
generates. Cortex Search tools don't need this (already have their own
warehouse from CREATE CORTEX SEARCH SERVICE). Queries still worked via
an apparent fallback, but fixed properly per Snowflake's own guidance
rather than relying on undocumented default behavior.
</commit_message>
<xml_diff>
--- a/docs/beginner_guide.docx
+++ b/docs/beginner_guide.docx
@@ -11312,7 +11312,33 @@
           <w:rFonts w:ascii="Consolas" w:hAnsi="Consolas"/>
           <w:sz w:val="18"/>
         </w:rPr>
-        <w:t xml:space="preserve">    MatchAnalyst: { semantic_view: "ABT_BUY.PUBLIC.ABT_BUY_SEMANTIC_VIEW" }</w:t>
+        <w:t xml:space="preserve">    MatchAnalyst:</w:t>
+      </w:r>
+    </w:p>
+    <w:p>
+      <w:pPr>
+        <w:spacing w:before="0" w:after="0"/>
+        <w:shd w:val="clear" w:color="auto" w:fill="EFEFEF"/>
+      </w:pPr>
+      <w:r>
+        <w:rPr>
+          <w:rFonts w:ascii="Consolas" w:hAnsi="Consolas"/>
+          <w:sz w:val="18"/>
+        </w:rPr>
+        <w:t xml:space="preserve">      semantic_view: "ABT_BUY.PUBLIC.ABT_BUY_SEMANTIC_VIEW"</w:t>
+      </w:r>
+    </w:p>
+    <w:p>
+      <w:pPr>
+        <w:spacing w:before="0" w:after="0"/>
+        <w:shd w:val="clear" w:color="auto" w:fill="EFEFEF"/>
+      </w:pPr>
+      <w:r>
+        <w:rPr>
+          <w:rFonts w:ascii="Consolas" w:hAnsi="Consolas"/>
+          <w:sz w:val="18"/>
+        </w:rPr>
+        <w:t xml:space="preserve">      execution_environment: { type: "warehouse", warehouse: "ABT_BUY_WH" }</w:t>
       </w:r>
     </w:p>
     <w:p>
@@ -12301,7 +12327,33 @@
           <w:rFonts w:ascii="Consolas" w:hAnsi="Consolas"/>
           <w:sz w:val="18"/>
         </w:rPr>
-        <w:t xml:space="preserve">    PricingAnalyst: { semantic_view: "ABT_BUY.PUBLIC.ABT_BUY_SEMANTIC_VIEW" }</w:t>
+        <w:t xml:space="preserve">    PricingAnalyst:</w:t>
+      </w:r>
+    </w:p>
+    <w:p>
+      <w:pPr>
+        <w:spacing w:before="0" w:after="0"/>
+        <w:shd w:val="clear" w:color="auto" w:fill="EFEFEF"/>
+      </w:pPr>
+      <w:r>
+        <w:rPr>
+          <w:rFonts w:ascii="Consolas" w:hAnsi="Consolas"/>
+          <w:sz w:val="18"/>
+        </w:rPr>
+        <w:t xml:space="preserve">      semantic_view: "ABT_BUY.PUBLIC.ABT_BUY_SEMANTIC_VIEW"</w:t>
+      </w:r>
+    </w:p>
+    <w:p>
+      <w:pPr>
+        <w:spacing w:before="0" w:after="0"/>
+        <w:shd w:val="clear" w:color="auto" w:fill="EFEFEF"/>
+      </w:pPr>
+      <w:r>
+        <w:rPr>
+          <w:rFonts w:ascii="Consolas" w:hAnsi="Consolas"/>
+          <w:sz w:val="18"/>
+        </w:rPr>
+        <w:t xml:space="preserve">      execution_environment: { type: "warehouse", warehouse: "ABT_BUY_WH" }</w:t>
       </w:r>
     </w:p>
     <w:p>
@@ -12978,7 +13030,33 @@
           <w:rFonts w:ascii="Consolas" w:hAnsi="Consolas"/>
           <w:sz w:val="18"/>
         </w:rPr>
-        <w:t xml:space="preserve">    MarketAnalyst: { semantic_view: "ABT_BUY.PUBLIC.ABT_BUY_SEMANTIC_VIEW" }</w:t>
+        <w:t xml:space="preserve">    MarketAnalyst:</w:t>
+      </w:r>
+    </w:p>
+    <w:p>
+      <w:pPr>
+        <w:spacing w:before="0" w:after="0"/>
+        <w:shd w:val="clear" w:color="auto" w:fill="EFEFEF"/>
+      </w:pPr>
+      <w:r>
+        <w:rPr>
+          <w:rFonts w:ascii="Consolas" w:hAnsi="Consolas"/>
+          <w:sz w:val="18"/>
+        </w:rPr>
+        <w:t xml:space="preserve">      semantic_view: "ABT_BUY.PUBLIC.ABT_BUY_SEMANTIC_VIEW"</w:t>
+      </w:r>
+    </w:p>
+    <w:p>
+      <w:pPr>
+        <w:spacing w:before="0" w:after="0"/>
+        <w:shd w:val="clear" w:color="auto" w:fill="EFEFEF"/>
+      </w:pPr>
+      <w:r>
+        <w:rPr>
+          <w:rFonts w:ascii="Consolas" w:hAnsi="Consolas"/>
+          <w:sz w:val="18"/>
+        </w:rPr>
+        <w:t xml:space="preserve">      execution_environment: { type: "warehouse", warehouse: "ABT_BUY_WH" }</w:t>
       </w:r>
     </w:p>
     <w:p>

</xml_diff>

<commit_message>
Fix CREATE MCP SERVER spec: confirmed real tool schema live
Confirmed against docs.snowflake.com/en/sql-reference/sql/create-mcp-server
after two failed attempts (the second returning an unhelpful "spec is
invalid: null" with no field indication): MCP tool types are an
uppercase enum distinct from CREATE AGENT's tool_spec.type
(CORTEX_ANALYST_MESSAGE / CORTEX_SEARCH_SERVICE_QUERY / SYSTEM_EXECUTE_SQL,
not the lowercase cortex_analyst_text_to_sql/cortex_search), every tool
requires title+description, and Cortex-object tools take a single
"identifier" (fully-qualified name) instead of semantic_view/
search_service keys. Server now creates successfully live.
</commit_message>
<xml_diff>
--- a/docs/beginner_guide.docx
+++ b/docs/beginner_guide.docx
@@ -13226,6 +13226,215 @@
       </w:r>
     </w:p>
     <w:p>
+      <w:r>
+        <w:rPr>
+          <w:b/>
+        </w:rPr>
+        <w:t>Confirmed live (Sept 2026):</w:t>
+      </w:r>
+      <w:r>
+        <w:rPr>
+          <w:b w:val="0"/>
+        </w:rPr>
+        <w:t xml:space="preserve"> MCP server tool types use a different, UPPERCASE enum than </w:t>
+      </w:r>
+      <w:r>
+        <w:rPr>
+          <w:rFonts w:ascii="Consolas" w:hAnsi="Consolas"/>
+          <w:sz w:val="20"/>
+        </w:rPr>
+        <w:t>CREATE AGENT</w:t>
+      </w:r>
+      <w:r>
+        <w:rPr>
+          <w:b w:val="0"/>
+        </w:rPr>
+        <w:t xml:space="preserve">'s </w:t>
+      </w:r>
+      <w:r>
+        <w:rPr>
+          <w:rFonts w:ascii="Consolas" w:hAnsi="Consolas"/>
+          <w:sz w:val="20"/>
+        </w:rPr>
+        <w:t>tool_spec.type</w:t>
+      </w:r>
+      <w:r>
+        <w:rPr>
+          <w:b w:val="0"/>
+        </w:rPr>
+        <w:t xml:space="preserve"> (lowercase </w:t>
+      </w:r>
+      <w:r>
+        <w:rPr>
+          <w:rFonts w:ascii="Consolas" w:hAnsi="Consolas"/>
+          <w:sz w:val="20"/>
+        </w:rPr>
+        <w:t>cortex_analyst_text_to_sql</w:t>
+      </w:r>
+      <w:r>
+        <w:rPr>
+          <w:b w:val="0"/>
+        </w:rPr>
+        <w:t>/</w:t>
+      </w:r>
+      <w:r>
+        <w:rPr>
+          <w:rFonts w:ascii="Consolas" w:hAnsi="Consolas"/>
+          <w:sz w:val="20"/>
+        </w:rPr>
+        <w:t>cortex_search</w:t>
+      </w:r>
+      <w:r>
+        <w:rPr>
+          <w:b w:val="0"/>
+        </w:rPr>
+        <w:t xml:space="preserve"> do NOT work here). Valid types: </w:t>
+      </w:r>
+      <w:r>
+        <w:rPr>
+          <w:rFonts w:ascii="Consolas" w:hAnsi="Consolas"/>
+          <w:sz w:val="20"/>
+        </w:rPr>
+        <w:t>CORTEX_SEARCH_SERVICE_QUERY</w:t>
+      </w:r>
+      <w:r>
+        <w:rPr>
+          <w:b w:val="0"/>
+        </w:rPr>
+        <w:t xml:space="preserve">, </w:t>
+      </w:r>
+      <w:r>
+        <w:rPr>
+          <w:rFonts w:ascii="Consolas" w:hAnsi="Consolas"/>
+          <w:sz w:val="20"/>
+        </w:rPr>
+        <w:t>CORTEX_ANALYST_MESSAGE</w:t>
+      </w:r>
+      <w:r>
+        <w:rPr>
+          <w:b w:val="0"/>
+        </w:rPr>
+        <w:t xml:space="preserve">, </w:t>
+      </w:r>
+      <w:r>
+        <w:rPr>
+          <w:rFonts w:ascii="Consolas" w:hAnsi="Consolas"/>
+          <w:sz w:val="20"/>
+        </w:rPr>
+        <w:t>SYSTEM_EXECUTE_SQL</w:t>
+      </w:r>
+      <w:r>
+        <w:rPr>
+          <w:b w:val="0"/>
+        </w:rPr>
+        <w:t xml:space="preserve">, </w:t>
+      </w:r>
+      <w:r>
+        <w:rPr>
+          <w:rFonts w:ascii="Consolas" w:hAnsi="Consolas"/>
+          <w:sz w:val="20"/>
+        </w:rPr>
+        <w:t>CORTEX_AGENT_RUN</w:t>
+      </w:r>
+      <w:r>
+        <w:rPr>
+          <w:b w:val="0"/>
+        </w:rPr>
+        <w:t xml:space="preserve">, </w:t>
+      </w:r>
+      <w:r>
+        <w:rPr>
+          <w:rFonts w:ascii="Consolas" w:hAnsi="Consolas"/>
+          <w:sz w:val="20"/>
+        </w:rPr>
+        <w:t>GENERIC</w:t>
+      </w:r>
+      <w:r>
+        <w:rPr>
+          <w:b w:val="0"/>
+        </w:rPr>
+        <w:t xml:space="preserve">. Every tool also needs </w:t>
+      </w:r>
+      <w:r>
+        <w:rPr>
+          <w:rFonts w:ascii="Consolas" w:hAnsi="Consolas"/>
+          <w:sz w:val="20"/>
+        </w:rPr>
+        <w:t>title</w:t>
+      </w:r>
+      <w:r>
+        <w:rPr>
+          <w:b w:val="0"/>
+        </w:rPr>
+        <w:t xml:space="preserve"> and </w:t>
+      </w:r>
+      <w:r>
+        <w:rPr>
+          <w:rFonts w:ascii="Consolas" w:hAnsi="Consolas"/>
+          <w:sz w:val="20"/>
+        </w:rPr>
+        <w:t>description</w:t>
+      </w:r>
+      <w:r>
+        <w:rPr>
+          <w:b w:val="0"/>
+        </w:rPr>
+        <w:t xml:space="preserve"> fields — omitting them produces an unhelpful </w:t>
+      </w:r>
+      <w:r>
+        <w:rPr>
+          <w:rFonts w:ascii="Consolas" w:hAnsi="Consolas"/>
+          <w:sz w:val="20"/>
+        </w:rPr>
+        <w:t>"spec is invalid: null"</w:t>
+      </w:r>
+      <w:r>
+        <w:rPr>
+          <w:b w:val="0"/>
+        </w:rPr>
+        <w:t xml:space="preserve"> error with no indication of what's actually wrong. Cortex-object tools take one </w:t>
+      </w:r>
+      <w:r>
+        <w:rPr>
+          <w:rFonts w:ascii="Consolas" w:hAnsi="Consolas"/>
+          <w:sz w:val="20"/>
+        </w:rPr>
+        <w:t>identifier</w:t>
+      </w:r>
+      <w:r>
+        <w:rPr>
+          <w:b w:val="0"/>
+        </w:rPr>
+        <w:t xml:space="preserve"> (fully-qualified object name), not separate </w:t>
+      </w:r>
+      <w:r>
+        <w:rPr>
+          <w:rFonts w:ascii="Consolas" w:hAnsi="Consolas"/>
+          <w:sz w:val="20"/>
+        </w:rPr>
+        <w:t>semantic_view</w:t>
+      </w:r>
+      <w:r>
+        <w:rPr>
+          <w:b w:val="0"/>
+        </w:rPr>
+        <w:t>/</w:t>
+      </w:r>
+      <w:r>
+        <w:rPr>
+          <w:rFonts w:ascii="Consolas" w:hAnsi="Consolas"/>
+          <w:sz w:val="20"/>
+        </w:rPr>
+        <w:t>search_service</w:t>
+      </w:r>
+      <w:r>
+        <w:rPr>
+          <w:b w:val="0"/>
+        </w:rPr>
+        <w:t xml:space="preserve"> keys. The block below already reflects all of this.</w:t>
+      </w:r>
+    </w:p>
+    <w:p>
       <w:pPr>
         <w:spacing w:before="0" w:after="0"/>
         <w:shd w:val="clear" w:color="auto" w:fill="EFEFEF"/>
@@ -13313,111 +13522,176 @@
           <w:rFonts w:ascii="Consolas" w:hAnsi="Consolas"/>
           <w:sz w:val="18"/>
         </w:rPr>
-        <w:t xml:space="preserve">    - name: product_match_analyst</w:t>
-      </w:r>
-    </w:p>
-    <w:p>
-      <w:pPr>
-        <w:spacing w:before="0" w:after="0"/>
-        <w:shd w:val="clear" w:color="auto" w:fill="EFEFEF"/>
-      </w:pPr>
-      <w:r>
-        <w:rPr>
-          <w:rFonts w:ascii="Consolas" w:hAnsi="Consolas"/>
-          <w:sz w:val="18"/>
-        </w:rPr>
-        <w:t xml:space="preserve">      type: cortex_analyst_text_to_sql</w:t>
-      </w:r>
-    </w:p>
-    <w:p>
-      <w:pPr>
-        <w:spacing w:before="0" w:after="0"/>
-        <w:shd w:val="clear" w:color="auto" w:fill="EFEFEF"/>
-      </w:pPr>
-      <w:r>
-        <w:rPr>
-          <w:rFonts w:ascii="Consolas" w:hAnsi="Consolas"/>
-          <w:sz w:val="18"/>
-        </w:rPr>
-        <w:t xml:space="preserve">      semantic_view: ABT_BUY.PUBLIC.ABT_BUY_SEMANTIC_VIEW</w:t>
-      </w:r>
-    </w:p>
-    <w:p>
-      <w:pPr>
-        <w:spacing w:before="0" w:after="0"/>
-        <w:shd w:val="clear" w:color="auto" w:fill="EFEFEF"/>
-      </w:pPr>
-      <w:r>
-        <w:rPr>
-          <w:rFonts w:ascii="Consolas" w:hAnsi="Consolas"/>
-          <w:sz w:val="18"/>
-        </w:rPr>
-        <w:t xml:space="preserve">    - name: product_search</w:t>
-      </w:r>
-    </w:p>
-    <w:p>
-      <w:pPr>
-        <w:spacing w:before="0" w:after="0"/>
-        <w:shd w:val="clear" w:color="auto" w:fill="EFEFEF"/>
-      </w:pPr>
-      <w:r>
-        <w:rPr>
-          <w:rFonts w:ascii="Consolas" w:hAnsi="Consolas"/>
-          <w:sz w:val="18"/>
-        </w:rPr>
-        <w:t xml:space="preserve">      type: cortex_search</w:t>
-      </w:r>
-    </w:p>
-    <w:p>
-      <w:pPr>
-        <w:spacing w:before="0" w:after="0"/>
-        <w:shd w:val="clear" w:color="auto" w:fill="EFEFEF"/>
-      </w:pPr>
-      <w:r>
-        <w:rPr>
-          <w:rFonts w:ascii="Consolas" w:hAnsi="Consolas"/>
-          <w:sz w:val="18"/>
-        </w:rPr>
-        <w:t xml:space="preserve">      search_service: ABT_BUY.PUBLIC.PRODUCT_SEARCH_SVC</w:t>
-      </w:r>
-    </w:p>
-    <w:p>
-      <w:pPr>
-        <w:spacing w:before="0" w:after="0"/>
-        <w:shd w:val="clear" w:color="auto" w:fill="EFEFEF"/>
-      </w:pPr>
-      <w:r>
-        <w:rPr>
-          <w:rFonts w:ascii="Consolas" w:hAnsi="Consolas"/>
-          <w:sz w:val="18"/>
-        </w:rPr>
-        <w:t xml:space="preserve">    - name: read_only_sql</w:t>
-      </w:r>
-    </w:p>
-    <w:p>
-      <w:pPr>
-        <w:spacing w:before="0" w:after="0"/>
-        <w:shd w:val="clear" w:color="auto" w:fill="EFEFEF"/>
-      </w:pPr>
-      <w:r>
-        <w:rPr>
-          <w:rFonts w:ascii="Consolas" w:hAnsi="Consolas"/>
-          <w:sz w:val="18"/>
-        </w:rPr>
-        <w:t xml:space="preserve">      type: sql_execution</w:t>
-      </w:r>
-    </w:p>
-    <w:p>
-      <w:pPr>
-        <w:spacing w:before="0" w:after="0"/>
-        <w:shd w:val="clear" w:color="auto" w:fill="EFEFEF"/>
-      </w:pPr>
-      <w:r>
-        <w:rPr>
-          <w:rFonts w:ascii="Consolas" w:hAnsi="Consolas"/>
-          <w:sz w:val="18"/>
-        </w:rPr>
-        <w:t xml:space="preserve">      access_mode: read_only</w:t>
+        <w:t xml:space="preserve">    - name: "product_match_analyst"</w:t>
+      </w:r>
+    </w:p>
+    <w:p>
+      <w:pPr>
+        <w:spacing w:before="0" w:after="0"/>
+        <w:shd w:val="clear" w:color="auto" w:fill="EFEFEF"/>
+      </w:pPr>
+      <w:r>
+        <w:rPr>
+          <w:rFonts w:ascii="Consolas" w:hAnsi="Consolas"/>
+          <w:sz w:val="18"/>
+        </w:rPr>
+        <w:t xml:space="preserve">      type: "CORTEX_ANALYST_MESSAGE"</w:t>
+      </w:r>
+    </w:p>
+    <w:p>
+      <w:pPr>
+        <w:spacing w:before="0" w:after="0"/>
+        <w:shd w:val="clear" w:color="auto" w:fill="EFEFEF"/>
+      </w:pPr>
+      <w:r>
+        <w:rPr>
+          <w:rFonts w:ascii="Consolas" w:hAnsi="Consolas"/>
+          <w:sz w:val="18"/>
+        </w:rPr>
+        <w:t xml:space="preserve">      title: "Product Match Analyst"</w:t>
+      </w:r>
+    </w:p>
+    <w:p>
+      <w:pPr>
+        <w:spacing w:before="0" w:after="0"/>
+        <w:shd w:val="clear" w:color="auto" w:fill="EFEFEF"/>
+      </w:pPr>
+      <w:r>
+        <w:rPr>
+          <w:rFonts w:ascii="Consolas" w:hAnsi="Consolas"/>
+          <w:sz w:val="18"/>
+        </w:rPr>
+        <w:t xml:space="preserve">      description: "Answers natural-language questions about matched products, pricing, and matching accuracy via the Abt-Buy semantic view."</w:t>
+      </w:r>
+    </w:p>
+    <w:p>
+      <w:pPr>
+        <w:spacing w:before="0" w:after="0"/>
+        <w:shd w:val="clear" w:color="auto" w:fill="EFEFEF"/>
+      </w:pPr>
+      <w:r>
+        <w:rPr>
+          <w:rFonts w:ascii="Consolas" w:hAnsi="Consolas"/>
+          <w:sz w:val="18"/>
+        </w:rPr>
+        <w:t xml:space="preserve">      identifier: "ABT_BUY.PUBLIC.ABT_BUY_SEMANTIC_VIEW"</w:t>
+      </w:r>
+    </w:p>
+    <w:p>
+      <w:pPr>
+        <w:spacing w:before="0" w:after="0"/>
+        <w:shd w:val="clear" w:color="auto" w:fill="EFEFEF"/>
+      </w:pPr>
+      <w:r>
+        <w:rPr>
+          <w:rFonts w:ascii="Consolas" w:hAnsi="Consolas"/>
+          <w:sz w:val="18"/>
+        </w:rPr>
+        <w:t xml:space="preserve">    - name: "product_search"</w:t>
+      </w:r>
+    </w:p>
+    <w:p>
+      <w:pPr>
+        <w:spacing w:before="0" w:after="0"/>
+        <w:shd w:val="clear" w:color="auto" w:fill="EFEFEF"/>
+      </w:pPr>
+      <w:r>
+        <w:rPr>
+          <w:rFonts w:ascii="Consolas" w:hAnsi="Consolas"/>
+          <w:sz w:val="18"/>
+        </w:rPr>
+        <w:t xml:space="preserve">      type: "CORTEX_SEARCH_SERVICE_QUERY"</w:t>
+      </w:r>
+    </w:p>
+    <w:p>
+      <w:pPr>
+        <w:spacing w:before="0" w:after="0"/>
+        <w:shd w:val="clear" w:color="auto" w:fill="EFEFEF"/>
+      </w:pPr>
+      <w:r>
+        <w:rPr>
+          <w:rFonts w:ascii="Consolas" w:hAnsi="Consolas"/>
+          <w:sz w:val="18"/>
+        </w:rPr>
+        <w:t xml:space="preserve">      title: "Product Search"</w:t>
+      </w:r>
+    </w:p>
+    <w:p>
+      <w:pPr>
+        <w:spacing w:before="0" w:after="0"/>
+        <w:shd w:val="clear" w:color="auto" w:fill="EFEFEF"/>
+      </w:pPr>
+      <w:r>
+        <w:rPr>
+          <w:rFonts w:ascii="Consolas" w:hAnsi="Consolas"/>
+          <w:sz w:val="18"/>
+        </w:rPr>
+        <w:t xml:space="preserve">      description: "Hybrid vector+keyword search across both Abt and Buy product catalogs."</w:t>
+      </w:r>
+    </w:p>
+    <w:p>
+      <w:pPr>
+        <w:spacing w:before="0" w:after="0"/>
+        <w:shd w:val="clear" w:color="auto" w:fill="EFEFEF"/>
+      </w:pPr>
+      <w:r>
+        <w:rPr>
+          <w:rFonts w:ascii="Consolas" w:hAnsi="Consolas"/>
+          <w:sz w:val="18"/>
+        </w:rPr>
+        <w:t xml:space="preserve">      identifier: "ABT_BUY.PUBLIC.PRODUCT_SEARCH_SVC"</w:t>
+      </w:r>
+    </w:p>
+    <w:p>
+      <w:pPr>
+        <w:spacing w:before="0" w:after="0"/>
+        <w:shd w:val="clear" w:color="auto" w:fill="EFEFEF"/>
+      </w:pPr>
+      <w:r>
+        <w:rPr>
+          <w:rFonts w:ascii="Consolas" w:hAnsi="Consolas"/>
+          <w:sz w:val="18"/>
+        </w:rPr>
+        <w:t xml:space="preserve">    - name: "read_only_sql"</w:t>
+      </w:r>
+    </w:p>
+    <w:p>
+      <w:pPr>
+        <w:spacing w:before="0" w:after="0"/>
+        <w:shd w:val="clear" w:color="auto" w:fill="EFEFEF"/>
+      </w:pPr>
+      <w:r>
+        <w:rPr>
+          <w:rFonts w:ascii="Consolas" w:hAnsi="Consolas"/>
+          <w:sz w:val="18"/>
+        </w:rPr>
+        <w:t xml:space="preserve">      type: "SYSTEM_EXECUTE_SQL"</w:t>
+      </w:r>
+    </w:p>
+    <w:p>
+      <w:pPr>
+        <w:spacing w:before="0" w:after="0"/>
+        <w:shd w:val="clear" w:color="auto" w:fill="EFEFEF"/>
+      </w:pPr>
+      <w:r>
+        <w:rPr>
+          <w:rFonts w:ascii="Consolas" w:hAnsi="Consolas"/>
+          <w:sz w:val="18"/>
+        </w:rPr>
+        <w:t xml:space="preserve">      title: "Read-Only SQL Execution"</w:t>
+      </w:r>
+    </w:p>
+    <w:p>
+      <w:pPr>
+        <w:spacing w:before="0" w:after="0"/>
+        <w:shd w:val="clear" w:color="auto" w:fill="EFEFEF"/>
+      </w:pPr>
+      <w:r>
+        <w:rPr>
+          <w:rFonts w:ascii="Consolas" w:hAnsi="Consolas"/>
+          <w:sz w:val="18"/>
+        </w:rPr>
+        <w:t xml:space="preserve">      description: "Executes read-only SQL queries against the Abt-Buy database."</w:t>
       </w:r>
     </w:p>
     <w:p>

</xml_diff>

<commit_message>
Rewrite Part 9 (Streamlit) with the actual working SQL-based deployment path
Confirmed live: the Snowsight UI wizard for "Create from repository" hit
several ACCOUNTADMIN privilege gaps and a confusing "already exists" loop,
all because ACCOUNTADMIN doesn't automatically have rights on objects
owned by ABT_BUY_ROLE. Documented the more reliable direct-SQL path
(CREATE API INTEGRATION with a trailing-slash prefix, CREATE GIT
REPOSITORY, CREATE STREAMLIT with ROOT_LOCATION pointing at the repo)
with every grant needed up front, keeping the UI path as a fallback.
Also added the 3 supporting accuracy views (INCL_REVIEW, FALSE_POSITIVES,
FALSE_NEGATIVES) that Step 4.7 had omitted but the Streamlit app needs,
and 5 new appendix troubleshooting rows.
</commit_message>
<xml_diff>
--- a/docs/beginner_guide.docx
+++ b/docs/beginner_guide.docx
@@ -8669,6 +8669,480 @@
       </w:r>
     </w:p>
     <w:p>
+      <w:r>
+        <w:rPr>
+          <w:b/>
+        </w:rPr>
+        <w:t>Also create these three supporting views now</w:t>
+      </w:r>
+      <w:r>
+        <w:rPr>
+          <w:b w:val="0"/>
+        </w:rPr>
+        <w:t xml:space="preserve"> — the Streamlit "Matching Accuracy" page (Part 9) depends on them, and it's easy to forget them since they're not needed for the headline metric above:</w:t>
+      </w:r>
+    </w:p>
+    <w:p>
+      <w:pPr>
+        <w:spacing w:before="0" w:after="0"/>
+        <w:shd w:val="clear" w:color="auto" w:fill="EFEFEF"/>
+      </w:pPr>
+      <w:r>
+        <w:rPr>
+          <w:rFonts w:ascii="Consolas" w:hAnsi="Consolas"/>
+          <w:sz w:val="18"/>
+        </w:rPr>
+        <w:t>CREATE OR REPLACE VIEW V_MATCHING_ACCURACY_INCL_REVIEW AS</w:t>
+      </w:r>
+    </w:p>
+    <w:p>
+      <w:pPr>
+        <w:spacing w:before="0" w:after="0"/>
+        <w:shd w:val="clear" w:color="auto" w:fill="EFEFEF"/>
+      </w:pPr>
+      <w:r>
+        <w:rPr>
+          <w:rFonts w:ascii="Consolas" w:hAnsi="Consolas"/>
+          <w:sz w:val="18"/>
+        </w:rPr>
+        <w:t>WITH predicted AS (</w:t>
+      </w:r>
+    </w:p>
+    <w:p>
+      <w:pPr>
+        <w:spacing w:before="0" w:after="0"/>
+        <w:shd w:val="clear" w:color="auto" w:fill="EFEFEF"/>
+      </w:pPr>
+      <w:r>
+        <w:rPr>
+          <w:rFonts w:ascii="Consolas" w:hAnsi="Consolas"/>
+          <w:sz w:val="18"/>
+        </w:rPr>
+        <w:t xml:space="preserve">  SELECT abt_id, buy_id FROM MATCHED_PRODUCTS WHERE final_label IN ('MATCH', 'REVIEW')</w:t>
+      </w:r>
+    </w:p>
+    <w:p>
+      <w:pPr>
+        <w:spacing w:before="0" w:after="0"/>
+        <w:shd w:val="clear" w:color="auto" w:fill="EFEFEF"/>
+      </w:pPr>
+      <w:r>
+        <w:rPr>
+          <w:rFonts w:ascii="Consolas" w:hAnsi="Consolas"/>
+          <w:sz w:val="18"/>
+        </w:rPr>
+        <w:t>),</w:t>
+      </w:r>
+    </w:p>
+    <w:p>
+      <w:pPr>
+        <w:spacing w:before="0" w:after="0"/>
+        <w:shd w:val="clear" w:color="auto" w:fill="EFEFEF"/>
+      </w:pPr>
+      <w:r>
+        <w:rPr>
+          <w:rFonts w:ascii="Consolas" w:hAnsi="Consolas"/>
+          <w:sz w:val="18"/>
+        </w:rPr>
+        <w:t>tp AS (</w:t>
+      </w:r>
+    </w:p>
+    <w:p>
+      <w:pPr>
+        <w:spacing w:before="0" w:after="0"/>
+        <w:shd w:val="clear" w:color="auto" w:fill="EFEFEF"/>
+      </w:pPr>
+      <w:r>
+        <w:rPr>
+          <w:rFonts w:ascii="Consolas" w:hAnsi="Consolas"/>
+          <w:sz w:val="18"/>
+        </w:rPr>
+        <w:t xml:space="preserve">  SELECT COUNT(*) AS n FROM predicted p</w:t>
+      </w:r>
+    </w:p>
+    <w:p>
+      <w:pPr>
+        <w:spacing w:before="0" w:after="0"/>
+        <w:shd w:val="clear" w:color="auto" w:fill="EFEFEF"/>
+      </w:pPr>
+      <w:r>
+        <w:rPr>
+          <w:rFonts w:ascii="Consolas" w:hAnsi="Consolas"/>
+          <w:sz w:val="18"/>
+        </w:rPr>
+        <w:t xml:space="preserve">  JOIN GROUND_TRUTH_MATCHES gt ON gt.abt_id = p.abt_id AND gt.buy_id = p.buy_id</w:t>
+      </w:r>
+    </w:p>
+    <w:p>
+      <w:pPr>
+        <w:spacing w:before="0" w:after="0"/>
+        <w:shd w:val="clear" w:color="auto" w:fill="EFEFEF"/>
+      </w:pPr>
+      <w:r>
+        <w:rPr>
+          <w:rFonts w:ascii="Consolas" w:hAnsi="Consolas"/>
+          <w:sz w:val="18"/>
+        </w:rPr>
+        <w:t>),</w:t>
+      </w:r>
+    </w:p>
+    <w:p>
+      <w:pPr>
+        <w:spacing w:before="0" w:after="0"/>
+        <w:shd w:val="clear" w:color="auto" w:fill="EFEFEF"/>
+      </w:pPr>
+      <w:r>
+        <w:rPr>
+          <w:rFonts w:ascii="Consolas" w:hAnsi="Consolas"/>
+          <w:sz w:val="18"/>
+        </w:rPr>
+        <w:t>totals AS (</w:t>
+      </w:r>
+    </w:p>
+    <w:p>
+      <w:pPr>
+        <w:spacing w:before="0" w:after="0"/>
+        <w:shd w:val="clear" w:color="auto" w:fill="EFEFEF"/>
+      </w:pPr>
+      <w:r>
+        <w:rPr>
+          <w:rFonts w:ascii="Consolas" w:hAnsi="Consolas"/>
+          <w:sz w:val="18"/>
+        </w:rPr>
+        <w:t xml:space="preserve">  SELECT</w:t>
+      </w:r>
+    </w:p>
+    <w:p>
+      <w:pPr>
+        <w:spacing w:before="0" w:after="0"/>
+        <w:shd w:val="clear" w:color="auto" w:fill="EFEFEF"/>
+      </w:pPr>
+      <w:r>
+        <w:rPr>
+          <w:rFonts w:ascii="Consolas" w:hAnsi="Consolas"/>
+          <w:sz w:val="18"/>
+        </w:rPr>
+        <w:t xml:space="preserve">    (SELECT COUNT(*) FROM predicted) AS predicted_count,</w:t>
+      </w:r>
+    </w:p>
+    <w:p>
+      <w:pPr>
+        <w:spacing w:before="0" w:after="0"/>
+        <w:shd w:val="clear" w:color="auto" w:fill="EFEFEF"/>
+      </w:pPr>
+      <w:r>
+        <w:rPr>
+          <w:rFonts w:ascii="Consolas" w:hAnsi="Consolas"/>
+          <w:sz w:val="18"/>
+        </w:rPr>
+        <w:t xml:space="preserve">    (SELECT COUNT(*) FROM GROUND_TRUTH_MATCHES) AS ground_truth_count,</w:t>
+      </w:r>
+    </w:p>
+    <w:p>
+      <w:pPr>
+        <w:spacing w:before="0" w:after="0"/>
+        <w:shd w:val="clear" w:color="auto" w:fill="EFEFEF"/>
+      </w:pPr>
+      <w:r>
+        <w:rPr>
+          <w:rFonts w:ascii="Consolas" w:hAnsi="Consolas"/>
+          <w:sz w:val="18"/>
+        </w:rPr>
+        <w:t xml:space="preserve">    (SELECT n FROM tp) AS true_positives</w:t>
+      </w:r>
+    </w:p>
+    <w:p>
+      <w:pPr>
+        <w:spacing w:before="0" w:after="0"/>
+        <w:shd w:val="clear" w:color="auto" w:fill="EFEFEF"/>
+      </w:pPr>
+      <w:r>
+        <w:rPr>
+          <w:rFonts w:ascii="Consolas" w:hAnsi="Consolas"/>
+          <w:sz w:val="18"/>
+        </w:rPr>
+        <w:t>)</w:t>
+      </w:r>
+    </w:p>
+    <w:p>
+      <w:pPr>
+        <w:spacing w:before="0" w:after="0"/>
+        <w:shd w:val="clear" w:color="auto" w:fill="EFEFEF"/>
+      </w:pPr>
+      <w:r>
+        <w:rPr>
+          <w:rFonts w:ascii="Consolas" w:hAnsi="Consolas"/>
+          <w:sz w:val="18"/>
+        </w:rPr>
+        <w:t>SELECT</w:t>
+      </w:r>
+    </w:p>
+    <w:p>
+      <w:pPr>
+        <w:spacing w:before="0" w:after="0"/>
+        <w:shd w:val="clear" w:color="auto" w:fill="EFEFEF"/>
+      </w:pPr>
+      <w:r>
+        <w:rPr>
+          <w:rFonts w:ascii="Consolas" w:hAnsi="Consolas"/>
+          <w:sz w:val="18"/>
+        </w:rPr>
+        <w:t xml:space="preserve">  predicted_count, ground_truth_count, true_positives,</w:t>
+      </w:r>
+    </w:p>
+    <w:p>
+      <w:pPr>
+        <w:spacing w:before="0" w:after="0"/>
+        <w:shd w:val="clear" w:color="auto" w:fill="EFEFEF"/>
+      </w:pPr>
+      <w:r>
+        <w:rPr>
+          <w:rFonts w:ascii="Consolas" w:hAnsi="Consolas"/>
+          <w:sz w:val="18"/>
+        </w:rPr>
+        <w:t xml:space="preserve">  ROUND(true_positives / NULLIF(predicted_count,0), 4) AS precision,</w:t>
+      </w:r>
+    </w:p>
+    <w:p>
+      <w:pPr>
+        <w:spacing w:before="0" w:after="0"/>
+        <w:shd w:val="clear" w:color="auto" w:fill="EFEFEF"/>
+      </w:pPr>
+      <w:r>
+        <w:rPr>
+          <w:rFonts w:ascii="Consolas" w:hAnsi="Consolas"/>
+          <w:sz w:val="18"/>
+        </w:rPr>
+        <w:t xml:space="preserve">  ROUND(true_positives / NULLIF(ground_truth_count,0), 4) AS recall</w:t>
+      </w:r>
+    </w:p>
+    <w:p>
+      <w:pPr>
+        <w:spacing w:before="0" w:after="0"/>
+        <w:shd w:val="clear" w:color="auto" w:fill="EFEFEF"/>
+      </w:pPr>
+      <w:r>
+        <w:rPr>
+          <w:rFonts w:ascii="Consolas" w:hAnsi="Consolas"/>
+          <w:sz w:val="18"/>
+        </w:rPr>
+        <w:t>FROM totals;</w:t>
+      </w:r>
+    </w:p>
+    <w:p>
+      <w:pPr>
+        <w:spacing w:before="0" w:after="0"/>
+        <w:shd w:val="clear" w:color="auto" w:fill="EFEFEF"/>
+      </w:pPr>
+      <w:r>
+        <w:rPr>
+          <w:rFonts w:ascii="Consolas" w:hAnsi="Consolas"/>
+          <w:sz w:val="18"/>
+        </w:rPr>
+        <w:t xml:space="preserve"> </w:t>
+      </w:r>
+    </w:p>
+    <w:p>
+      <w:pPr>
+        <w:spacing w:before="0" w:after="0"/>
+        <w:shd w:val="clear" w:color="auto" w:fill="EFEFEF"/>
+      </w:pPr>
+      <w:r>
+        <w:rPr>
+          <w:rFonts w:ascii="Consolas" w:hAnsi="Consolas"/>
+          <w:sz w:val="18"/>
+        </w:rPr>
+        <w:t>CREATE OR REPLACE VIEW V_FALSE_POSITIVES AS</w:t>
+      </w:r>
+    </w:p>
+    <w:p>
+      <w:pPr>
+        <w:spacing w:before="0" w:after="0"/>
+        <w:shd w:val="clear" w:color="auto" w:fill="EFEFEF"/>
+      </w:pPr>
+      <w:r>
+        <w:rPr>
+          <w:rFonts w:ascii="Consolas" w:hAnsi="Consolas"/>
+          <w:sz w:val="18"/>
+        </w:rPr>
+        <w:t>SELECT ms.*, ap.name AS abt_name, bp.name AS buy_name</w:t>
+      </w:r>
+    </w:p>
+    <w:p>
+      <w:pPr>
+        <w:spacing w:before="0" w:after="0"/>
+        <w:shd w:val="clear" w:color="auto" w:fill="EFEFEF"/>
+      </w:pPr>
+      <w:r>
+        <w:rPr>
+          <w:rFonts w:ascii="Consolas" w:hAnsi="Consolas"/>
+          <w:sz w:val="18"/>
+        </w:rPr>
+        <w:t>FROM MATCH_SCORES ms</w:t>
+      </w:r>
+    </w:p>
+    <w:p>
+      <w:pPr>
+        <w:spacing w:before="0" w:after="0"/>
+        <w:shd w:val="clear" w:color="auto" w:fill="EFEFEF"/>
+      </w:pPr>
+      <w:r>
+        <w:rPr>
+          <w:rFonts w:ascii="Consolas" w:hAnsi="Consolas"/>
+          <w:sz w:val="18"/>
+        </w:rPr>
+        <w:t>JOIN ABT_PRODUCTS ap ON ap.id = ms.abt_id</w:t>
+      </w:r>
+    </w:p>
+    <w:p>
+      <w:pPr>
+        <w:spacing w:before="0" w:after="0"/>
+        <w:shd w:val="clear" w:color="auto" w:fill="EFEFEF"/>
+      </w:pPr>
+      <w:r>
+        <w:rPr>
+          <w:rFonts w:ascii="Consolas" w:hAnsi="Consolas"/>
+          <w:sz w:val="18"/>
+        </w:rPr>
+        <w:t>JOIN BUY_PRODUCTS bp ON bp.id = ms.buy_id</w:t>
+      </w:r>
+    </w:p>
+    <w:p>
+      <w:pPr>
+        <w:spacing w:before="0" w:after="0"/>
+        <w:shd w:val="clear" w:color="auto" w:fill="EFEFEF"/>
+      </w:pPr>
+      <w:r>
+        <w:rPr>
+          <w:rFonts w:ascii="Consolas" w:hAnsi="Consolas"/>
+          <w:sz w:val="18"/>
+        </w:rPr>
+        <w:t>LEFT JOIN GROUND_TRUTH_MATCHES gt ON gt.abt_id = ms.abt_id AND gt.buy_id = ms.buy_id</w:t>
+      </w:r>
+    </w:p>
+    <w:p>
+      <w:pPr>
+        <w:spacing w:before="0" w:after="0"/>
+        <w:shd w:val="clear" w:color="auto" w:fill="EFEFEF"/>
+      </w:pPr>
+      <w:r>
+        <w:rPr>
+          <w:rFonts w:ascii="Consolas" w:hAnsi="Consolas"/>
+          <w:sz w:val="18"/>
+        </w:rPr>
+        <w:t>WHERE ms.candidate_label = 'MATCH' AND gt.abt_id IS NULL;</w:t>
+      </w:r>
+    </w:p>
+    <w:p>
+      <w:pPr>
+        <w:spacing w:before="0" w:after="0"/>
+        <w:shd w:val="clear" w:color="auto" w:fill="EFEFEF"/>
+      </w:pPr>
+      <w:r>
+        <w:rPr>
+          <w:rFonts w:ascii="Consolas" w:hAnsi="Consolas"/>
+          <w:sz w:val="18"/>
+        </w:rPr>
+        <w:t xml:space="preserve"> </w:t>
+      </w:r>
+    </w:p>
+    <w:p>
+      <w:pPr>
+        <w:spacing w:before="0" w:after="0"/>
+        <w:shd w:val="clear" w:color="auto" w:fill="EFEFEF"/>
+      </w:pPr>
+      <w:r>
+        <w:rPr>
+          <w:rFonts w:ascii="Consolas" w:hAnsi="Consolas"/>
+          <w:sz w:val="18"/>
+        </w:rPr>
+        <w:t>CREATE OR REPLACE VIEW V_FALSE_NEGATIVES AS</w:t>
+      </w:r>
+    </w:p>
+    <w:p>
+      <w:pPr>
+        <w:spacing w:before="0" w:after="0"/>
+        <w:shd w:val="clear" w:color="auto" w:fill="EFEFEF"/>
+      </w:pPr>
+      <w:r>
+        <w:rPr>
+          <w:rFonts w:ascii="Consolas" w:hAnsi="Consolas"/>
+          <w:sz w:val="18"/>
+        </w:rPr>
+        <w:t>SELECT gt.abt_id, gt.buy_id, ap.name AS abt_name, bp.name AS buy_name, ms.final_confidence, ms.candidate_label, ms.explanation</w:t>
+      </w:r>
+    </w:p>
+    <w:p>
+      <w:pPr>
+        <w:spacing w:before="0" w:after="0"/>
+        <w:shd w:val="clear" w:color="auto" w:fill="EFEFEF"/>
+      </w:pPr>
+      <w:r>
+        <w:rPr>
+          <w:rFonts w:ascii="Consolas" w:hAnsi="Consolas"/>
+          <w:sz w:val="18"/>
+        </w:rPr>
+        <w:t>FROM GROUND_TRUTH_MATCHES gt</w:t>
+      </w:r>
+    </w:p>
+    <w:p>
+      <w:pPr>
+        <w:spacing w:before="0" w:after="0"/>
+        <w:shd w:val="clear" w:color="auto" w:fill="EFEFEF"/>
+      </w:pPr>
+      <w:r>
+        <w:rPr>
+          <w:rFonts w:ascii="Consolas" w:hAnsi="Consolas"/>
+          <w:sz w:val="18"/>
+        </w:rPr>
+        <w:t>JOIN ABT_PRODUCTS ap ON ap.id = gt.abt_id</w:t>
+      </w:r>
+    </w:p>
+    <w:p>
+      <w:pPr>
+        <w:spacing w:before="0" w:after="0"/>
+        <w:shd w:val="clear" w:color="auto" w:fill="EFEFEF"/>
+      </w:pPr>
+      <w:r>
+        <w:rPr>
+          <w:rFonts w:ascii="Consolas" w:hAnsi="Consolas"/>
+          <w:sz w:val="18"/>
+        </w:rPr>
+        <w:t>JOIN BUY_PRODUCTS bp ON bp.id = gt.buy_id</w:t>
+      </w:r>
+    </w:p>
+    <w:p>
+      <w:pPr>
+        <w:spacing w:before="0" w:after="0"/>
+        <w:shd w:val="clear" w:color="auto" w:fill="EFEFEF"/>
+      </w:pPr>
+      <w:r>
+        <w:rPr>
+          <w:rFonts w:ascii="Consolas" w:hAnsi="Consolas"/>
+          <w:sz w:val="18"/>
+        </w:rPr>
+        <w:t>LEFT JOIN MATCH_SCORES ms ON ms.abt_id = gt.abt_id AND ms.buy_id = gt.buy_id</w:t>
+      </w:r>
+    </w:p>
+    <w:p>
+      <w:pPr>
+        <w:spacing w:before="0" w:after="0"/>
+        <w:shd w:val="clear" w:color="auto" w:fill="EFEFEF"/>
+      </w:pPr>
+      <w:r>
+        <w:rPr>
+          <w:rFonts w:ascii="Consolas" w:hAnsi="Consolas"/>
+          <w:sz w:val="18"/>
+        </w:rPr>
+        <w:t>WHERE ms.abt_id IS NULL OR ms.candidate_label != 'MATCH';</w:t>
+      </w:r>
+    </w:p>
+    <w:p>
+      <w:pPr>
+        <w:spacing w:before="0" w:after="120"/>
+      </w:pPr>
+    </w:p>
+    <w:p>
       <w:pPr>
         <w:spacing w:after="120"/>
         <w:pBdr>
@@ -13824,7 +14298,7 @@
         <w:rPr>
           <w:b w:val="0"/>
         </w:rPr>
-        <w:t xml:space="preserve"> GitHub is set up (Part 10), using Snowsight's "create from repository" feature, which needs your repo to exist on GitHub first.</w:t>
+        <w:t xml:space="preserve"> GitHub is set up (Part 10) — Snowflake needs to read the code from your GitHub repo, so that has to exist first.</w:t>
       </w:r>
     </w:p>
     <w:p>
@@ -13832,18 +14306,561 @@
         <w:rPr>
           <w:b/>
         </w:rPr>
-        <w:t>Step 9.1</w:t>
+        <w:t>Confirmed live (Sept 2026): the Snowsight UI wizard ("+ Streamlit" → "Create from repository") is finicky</w:t>
       </w:r>
       <w:r>
         <w:rPr>
           <w:b w:val="0"/>
         </w:rPr>
-        <w:t xml:space="preserve"> — In Snowsight, left sidebar → </w:t>
-      </w:r>
+        <w:t xml:space="preserve"> — it can hit several privilege gaps and a confusing "already exists" error along the way (all because the wizard runs as </w:t>
+      </w:r>
+      <w:r>
+        <w:rPr>
+          <w:rFonts w:ascii="Consolas" w:hAnsi="Consolas"/>
+          <w:sz w:val="20"/>
+        </w:rPr>
+        <w:t>ACCOUNTADMIN</w:t>
+      </w:r>
+      <w:r>
+        <w:rPr>
+          <w:b w:val="0"/>
+        </w:rPr>
+        <w:t xml:space="preserve">, which doesn't automatically have rights on objects owned by </w:t>
+      </w:r>
+      <w:r>
+        <w:rPr>
+          <w:rFonts w:ascii="Consolas" w:hAnsi="Consolas"/>
+          <w:sz w:val="20"/>
+        </w:rPr>
+        <w:t>ABT_BUY_ROLE</w:t>
+      </w:r>
+      <w:r>
+        <w:rPr>
+          <w:b w:val="0"/>
+        </w:rPr>
+        <w:t xml:space="preserve">). The path below does the same thing directly in SQL, which is more reliable and faster to fix if something's still off. Run all of this as </w:t>
+      </w:r>
+      <w:r>
+        <w:rPr>
+          <w:rFonts w:ascii="Consolas" w:hAnsi="Consolas"/>
+          <w:sz w:val="20"/>
+        </w:rPr>
+        <w:t>ACCOUNTADMIN</w:t>
+      </w:r>
+      <w:r>
+        <w:rPr>
+          <w:b w:val="0"/>
+        </w:rPr>
+        <w:t>.</w:t>
+      </w:r>
+    </w:p>
+    <w:p>
       <w:r>
         <w:rPr>
           <w:b/>
         </w:rPr>
+        <w:t>Step 9.1 — Grant ACCOUNTADMIN what it needs up front</w:t>
+      </w:r>
+      <w:r>
+        <w:rPr>
+          <w:b w:val="0"/>
+        </w:rPr>
+        <w:t xml:space="preserve"> (avoids discovering these one at a time):</w:t>
+      </w:r>
+    </w:p>
+    <w:p>
+      <w:pPr>
+        <w:spacing w:before="0" w:after="0"/>
+        <w:shd w:val="clear" w:color="auto" w:fill="EFEFEF"/>
+      </w:pPr>
+      <w:r>
+        <w:rPr>
+          <w:rFonts w:ascii="Consolas" w:hAnsi="Consolas"/>
+          <w:sz w:val="18"/>
+        </w:rPr>
+        <w:t>USE ROLE ACCOUNTADMIN;</w:t>
+      </w:r>
+    </w:p>
+    <w:p>
+      <w:pPr>
+        <w:spacing w:before="0" w:after="0"/>
+        <w:shd w:val="clear" w:color="auto" w:fill="EFEFEF"/>
+      </w:pPr>
+      <w:r>
+        <w:rPr>
+          <w:rFonts w:ascii="Consolas" w:hAnsi="Consolas"/>
+          <w:sz w:val="18"/>
+        </w:rPr>
+        <w:t>GRANT USAGE ON DATABASE ABT_BUY TO ROLE ACCOUNTADMIN;</w:t>
+      </w:r>
+    </w:p>
+    <w:p>
+      <w:pPr>
+        <w:spacing w:before="0" w:after="0"/>
+        <w:shd w:val="clear" w:color="auto" w:fill="EFEFEF"/>
+      </w:pPr>
+      <w:r>
+        <w:rPr>
+          <w:rFonts w:ascii="Consolas" w:hAnsi="Consolas"/>
+          <w:sz w:val="18"/>
+        </w:rPr>
+        <w:t>GRANT USAGE ON SCHEMA ABT_BUY.PUBLIC TO ROLE ACCOUNTADMIN;</w:t>
+      </w:r>
+    </w:p>
+    <w:p>
+      <w:pPr>
+        <w:spacing w:before="0" w:after="0"/>
+        <w:shd w:val="clear" w:color="auto" w:fill="EFEFEF"/>
+      </w:pPr>
+      <w:r>
+        <w:rPr>
+          <w:rFonts w:ascii="Consolas" w:hAnsi="Consolas"/>
+          <w:sz w:val="18"/>
+        </w:rPr>
+        <w:t>GRANT USAGE ON WAREHOUSE ABT_BUY_WH TO ROLE ACCOUNTADMIN;</w:t>
+      </w:r>
+    </w:p>
+    <w:p>
+      <w:pPr>
+        <w:spacing w:before="0" w:after="0"/>
+        <w:shd w:val="clear" w:color="auto" w:fill="EFEFEF"/>
+      </w:pPr>
+      <w:r>
+        <w:rPr>
+          <w:rFonts w:ascii="Consolas" w:hAnsi="Consolas"/>
+          <w:sz w:val="18"/>
+        </w:rPr>
+        <w:t>GRANT CREATE STREAMLIT ON SCHEMA ABT_BUY.PUBLIC TO ROLE ACCOUNTADMIN;</w:t>
+      </w:r>
+    </w:p>
+    <w:p>
+      <w:pPr>
+        <w:spacing w:before="0" w:after="0"/>
+        <w:shd w:val="clear" w:color="auto" w:fill="EFEFEF"/>
+      </w:pPr>
+      <w:r>
+        <w:rPr>
+          <w:rFonts w:ascii="Consolas" w:hAnsi="Consolas"/>
+          <w:sz w:val="18"/>
+        </w:rPr>
+        <w:t>GRANT CREATE GIT REPOSITORY ON SCHEMA ABT_BUY.PUBLIC TO ROLE ACCOUNTADMIN;</w:t>
+      </w:r>
+    </w:p>
+    <w:p>
+      <w:pPr>
+        <w:spacing w:before="0" w:after="0"/>
+        <w:shd w:val="clear" w:color="auto" w:fill="EFEFEF"/>
+      </w:pPr>
+      <w:r>
+        <w:rPr>
+          <w:rFonts w:ascii="Consolas" w:hAnsi="Consolas"/>
+          <w:sz w:val="18"/>
+        </w:rPr>
+        <w:t>GRANT SELECT ON ALL TABLES IN SCHEMA ABT_BUY.PUBLIC TO ROLE ACCOUNTADMIN;</w:t>
+      </w:r>
+    </w:p>
+    <w:p>
+      <w:pPr>
+        <w:spacing w:before="0" w:after="0"/>
+        <w:shd w:val="clear" w:color="auto" w:fill="EFEFEF"/>
+      </w:pPr>
+      <w:r>
+        <w:rPr>
+          <w:rFonts w:ascii="Consolas" w:hAnsi="Consolas"/>
+          <w:sz w:val="18"/>
+        </w:rPr>
+        <w:t>GRANT SELECT ON ALL VIEWS IN SCHEMA ABT_BUY.PUBLIC TO ROLE ACCOUNTADMIN;</w:t>
+      </w:r>
+    </w:p>
+    <w:p>
+      <w:pPr>
+        <w:spacing w:before="0" w:after="0"/>
+        <w:shd w:val="clear" w:color="auto" w:fill="EFEFEF"/>
+      </w:pPr>
+      <w:r>
+        <w:rPr>
+          <w:rFonts w:ascii="Consolas" w:hAnsi="Consolas"/>
+          <w:sz w:val="18"/>
+        </w:rPr>
+        <w:t>GRANT SELECT ON FUTURE TABLES IN SCHEMA ABT_BUY.PUBLIC TO ROLE ACCOUNTADMIN;</w:t>
+      </w:r>
+    </w:p>
+    <w:p>
+      <w:pPr>
+        <w:spacing w:before="0" w:after="0"/>
+        <w:shd w:val="clear" w:color="auto" w:fill="EFEFEF"/>
+      </w:pPr>
+      <w:r>
+        <w:rPr>
+          <w:rFonts w:ascii="Consolas" w:hAnsi="Consolas"/>
+          <w:sz w:val="18"/>
+        </w:rPr>
+        <w:t>GRANT SELECT ON FUTURE VIEWS IN SCHEMA ABT_BUY.PUBLIC TO ROLE ACCOUNTADMIN;</w:t>
+      </w:r>
+    </w:p>
+    <w:p>
+      <w:pPr>
+        <w:spacing w:before="0" w:after="0"/>
+        <w:shd w:val="clear" w:color="auto" w:fill="EFEFEF"/>
+      </w:pPr>
+      <w:r>
+        <w:rPr>
+          <w:rFonts w:ascii="Consolas" w:hAnsi="Consolas"/>
+          <w:sz w:val="18"/>
+        </w:rPr>
+        <w:t>GRANT USAGE ON ALL PROCEDURES IN SCHEMA ABT_BUY.PUBLIC TO ROLE ACCOUNTADMIN;</w:t>
+      </w:r>
+    </w:p>
+    <w:p>
+      <w:pPr>
+        <w:spacing w:before="0" w:after="0"/>
+        <w:shd w:val="clear" w:color="auto" w:fill="EFEFEF"/>
+      </w:pPr>
+      <w:r>
+        <w:rPr>
+          <w:rFonts w:ascii="Consolas" w:hAnsi="Consolas"/>
+          <w:sz w:val="18"/>
+        </w:rPr>
+        <w:t>GRANT USAGE ON FUTURE PROCEDURES IN SCHEMA ABT_BUY.PUBLIC TO ROLE ACCOUNTADMIN;</w:t>
+      </w:r>
+    </w:p>
+    <w:p>
+      <w:pPr>
+        <w:spacing w:before="0" w:after="120"/>
+      </w:pPr>
+    </w:p>
+    <w:p>
+      <w:r>
+        <w:rPr>
+          <w:b w:val="0"/>
+        </w:rPr>
+        <w:t xml:space="preserve">(The </w:t>
+      </w:r>
+      <w:r>
+        <w:rPr>
+          <w:rFonts w:ascii="Consolas" w:hAnsi="Consolas"/>
+          <w:sz w:val="20"/>
+        </w:rPr>
+        <w:t>SELECT</w:t>
+      </w:r>
+      <w:r>
+        <w:rPr>
+          <w:b w:val="0"/>
+        </w:rPr>
+        <w:t>/</w:t>
+      </w:r>
+      <w:r>
+        <w:rPr>
+          <w:rFonts w:ascii="Consolas" w:hAnsi="Consolas"/>
+          <w:sz w:val="20"/>
+        </w:rPr>
+        <w:t>USAGE</w:t>
+      </w:r>
+      <w:r>
+        <w:rPr>
+          <w:b w:val="0"/>
+        </w:rPr>
+        <w:t xml:space="preserve"> grants matter because the Streamlit app "runs with owner's rights" — the owner is whichever role created the </w:t>
+      </w:r>
+      <w:r>
+        <w:rPr>
+          <w:rFonts w:ascii="Consolas" w:hAnsi="Consolas"/>
+          <w:sz w:val="20"/>
+        </w:rPr>
+        <w:t>STREAMLIT</w:t>
+      </w:r>
+      <w:r>
+        <w:rPr>
+          <w:b w:val="0"/>
+        </w:rPr>
+        <w:t xml:space="preserve"> object, which is </w:t>
+      </w:r>
+      <w:r>
+        <w:rPr>
+          <w:rFonts w:ascii="Consolas" w:hAnsi="Consolas"/>
+          <w:sz w:val="20"/>
+        </w:rPr>
+        <w:t>ACCOUNTADMIN</w:t>
+      </w:r>
+      <w:r>
+        <w:rPr>
+          <w:b w:val="0"/>
+        </w:rPr>
+        <w:t xml:space="preserve"> here — so it needs read access to everything the dashboard queries, not just the objects it directly creates.)</w:t>
+      </w:r>
+    </w:p>
+    <w:p>
+      <w:r>
+        <w:rPr>
+          <w:b/>
+        </w:rPr>
+        <w:t>Step 9.2 — Create a "no authentication" API integration for your public GitHub repo:</w:t>
+      </w:r>
+    </w:p>
+    <w:p>
+      <w:pPr>
+        <w:spacing w:before="0" w:after="0"/>
+        <w:shd w:val="clear" w:color="auto" w:fill="EFEFEF"/>
+      </w:pPr>
+      <w:r>
+        <w:rPr>
+          <w:rFonts w:ascii="Consolas" w:hAnsi="Consolas"/>
+          <w:sz w:val="18"/>
+        </w:rPr>
+        <w:t>CREATE API INTEGRATION &lt;YOUR_REPO_NAME&gt;_GIT_INTEGRATION</w:t>
+      </w:r>
+    </w:p>
+    <w:p>
+      <w:pPr>
+        <w:spacing w:before="0" w:after="0"/>
+        <w:shd w:val="clear" w:color="auto" w:fill="EFEFEF"/>
+      </w:pPr>
+      <w:r>
+        <w:rPr>
+          <w:rFonts w:ascii="Consolas" w:hAnsi="Consolas"/>
+          <w:sz w:val="18"/>
+        </w:rPr>
+        <w:t xml:space="preserve">  API_PROVIDER = git_https_api</w:t>
+      </w:r>
+    </w:p>
+    <w:p>
+      <w:pPr>
+        <w:spacing w:before="0" w:after="0"/>
+        <w:shd w:val="clear" w:color="auto" w:fill="EFEFEF"/>
+      </w:pPr>
+      <w:r>
+        <w:rPr>
+          <w:rFonts w:ascii="Consolas" w:hAnsi="Consolas"/>
+          <w:sz w:val="18"/>
+        </w:rPr>
+        <w:t xml:space="preserve">  API_ALLOWED_PREFIXES = ('https://github.com/&lt;your-github-username&gt;/')</w:t>
+      </w:r>
+    </w:p>
+    <w:p>
+      <w:pPr>
+        <w:spacing w:before="0" w:after="0"/>
+        <w:shd w:val="clear" w:color="auto" w:fill="EFEFEF"/>
+      </w:pPr>
+      <w:r>
+        <w:rPr>
+          <w:rFonts w:ascii="Consolas" w:hAnsi="Consolas"/>
+          <w:sz w:val="18"/>
+        </w:rPr>
+        <w:t xml:space="preserve">  ALLOWED_AUTHENTICATION_SECRETS = none</w:t>
+      </w:r>
+    </w:p>
+    <w:p>
+      <w:pPr>
+        <w:spacing w:before="0" w:after="0"/>
+        <w:shd w:val="clear" w:color="auto" w:fill="EFEFEF"/>
+      </w:pPr>
+      <w:r>
+        <w:rPr>
+          <w:rFonts w:ascii="Consolas" w:hAnsi="Consolas"/>
+          <w:sz w:val="18"/>
+        </w:rPr>
+        <w:t xml:space="preserve">  ENABLED = TRUE;</w:t>
+      </w:r>
+    </w:p>
+    <w:p>
+      <w:pPr>
+        <w:spacing w:before="0" w:after="120"/>
+      </w:pPr>
+    </w:p>
+    <w:p>
+      <w:r>
+        <w:rPr>
+          <w:b w:val="0"/>
+        </w:rPr>
+        <w:t xml:space="preserve">Use a trailing slash on the prefix (covers your whole GitHub namespace) — a prefix ending exactly at the repo name without a slash can fail with a confusing "location not allowed" error when Snowflake appends </w:t>
+      </w:r>
+      <w:r>
+        <w:rPr>
+          <w:rFonts w:ascii="Consolas" w:hAnsi="Consolas"/>
+          <w:sz w:val="20"/>
+        </w:rPr>
+        <w:t>.git</w:t>
+      </w:r>
+      <w:r>
+        <w:rPr>
+          <w:b w:val="0"/>
+        </w:rPr>
+        <w:t xml:space="preserve"> to the actual clone URL.</w:t>
+      </w:r>
+    </w:p>
+    <w:p>
+      <w:r>
+        <w:rPr>
+          <w:b/>
+        </w:rPr>
+        <w:t>Step 9.3 — Register the git repository:</w:t>
+      </w:r>
+    </w:p>
+    <w:p>
+      <w:pPr>
+        <w:spacing w:before="0" w:after="0"/>
+        <w:shd w:val="clear" w:color="auto" w:fill="EFEFEF"/>
+      </w:pPr>
+      <w:r>
+        <w:rPr>
+          <w:rFonts w:ascii="Consolas" w:hAnsi="Consolas"/>
+          <w:sz w:val="18"/>
+        </w:rPr>
+        <w:t>CREATE GIT REPOSITORY ABT_BUY.PUBLIC.&lt;YOUR_REPO_NAME&gt;</w:t>
+      </w:r>
+    </w:p>
+    <w:p>
+      <w:pPr>
+        <w:spacing w:before="0" w:after="0"/>
+        <w:shd w:val="clear" w:color="auto" w:fill="EFEFEF"/>
+      </w:pPr>
+      <w:r>
+        <w:rPr>
+          <w:rFonts w:ascii="Consolas" w:hAnsi="Consolas"/>
+          <w:sz w:val="18"/>
+        </w:rPr>
+        <w:t xml:space="preserve">  API_INTEGRATION = &lt;YOUR_REPO_NAME&gt;_GIT_INTEGRATION</w:t>
+      </w:r>
+    </w:p>
+    <w:p>
+      <w:pPr>
+        <w:spacing w:before="0" w:after="0"/>
+        <w:shd w:val="clear" w:color="auto" w:fill="EFEFEF"/>
+      </w:pPr>
+      <w:r>
+        <w:rPr>
+          <w:rFonts w:ascii="Consolas" w:hAnsi="Consolas"/>
+          <w:sz w:val="18"/>
+        </w:rPr>
+        <w:t xml:space="preserve">  ORIGIN = 'https://github.com/&lt;your-github-username&gt;/&lt;your-repo-name&gt;.git';</w:t>
+      </w:r>
+    </w:p>
+    <w:p>
+      <w:pPr>
+        <w:spacing w:before="0" w:after="120"/>
+      </w:pPr>
+    </w:p>
+    <w:p>
+      <w:r>
+        <w:rPr>
+          <w:b/>
+        </w:rPr>
+        <w:t>Step 9.4 — Create the Streamlit app, pointing at the repo directly:</w:t>
+      </w:r>
+    </w:p>
+    <w:p>
+      <w:pPr>
+        <w:spacing w:before="0" w:after="0"/>
+        <w:shd w:val="clear" w:color="auto" w:fill="EFEFEF"/>
+      </w:pPr>
+      <w:r>
+        <w:rPr>
+          <w:rFonts w:ascii="Consolas" w:hAnsi="Consolas"/>
+          <w:sz w:val="18"/>
+        </w:rPr>
+        <w:t>USE WAREHOUSE ABT_BUY_WH;</w:t>
+      </w:r>
+    </w:p>
+    <w:p>
+      <w:pPr>
+        <w:spacing w:before="0" w:after="0"/>
+        <w:shd w:val="clear" w:color="auto" w:fill="EFEFEF"/>
+      </w:pPr>
+      <w:r>
+        <w:rPr>
+          <w:rFonts w:ascii="Consolas" w:hAnsi="Consolas"/>
+          <w:sz w:val="18"/>
+        </w:rPr>
+        <w:t xml:space="preserve"> </w:t>
+      </w:r>
+    </w:p>
+    <w:p>
+      <w:pPr>
+        <w:spacing w:before="0" w:after="0"/>
+        <w:shd w:val="clear" w:color="auto" w:fill="EFEFEF"/>
+      </w:pPr>
+      <w:r>
+        <w:rPr>
+          <w:rFonts w:ascii="Consolas" w:hAnsi="Consolas"/>
+          <w:sz w:val="18"/>
+        </w:rPr>
+        <w:t>CREATE OR REPLACE STREAMLIT ABT_BUY.PUBLIC.ABT_BUY_DASHBOARD</w:t>
+      </w:r>
+    </w:p>
+    <w:p>
+      <w:pPr>
+        <w:spacing w:before="0" w:after="0"/>
+        <w:shd w:val="clear" w:color="auto" w:fill="EFEFEF"/>
+      </w:pPr>
+      <w:r>
+        <w:rPr>
+          <w:rFonts w:ascii="Consolas" w:hAnsi="Consolas"/>
+          <w:sz w:val="18"/>
+        </w:rPr>
+        <w:t xml:space="preserve">  ROOT_LOCATION = '@ABT_BUY.PUBLIC.&lt;YOUR_REPO_NAME&gt;/branches/main/streamlit'</w:t>
+      </w:r>
+    </w:p>
+    <w:p>
+      <w:pPr>
+        <w:spacing w:before="0" w:after="0"/>
+        <w:shd w:val="clear" w:color="auto" w:fill="EFEFEF"/>
+      </w:pPr>
+      <w:r>
+        <w:rPr>
+          <w:rFonts w:ascii="Consolas" w:hAnsi="Consolas"/>
+          <w:sz w:val="18"/>
+        </w:rPr>
+        <w:t xml:space="preserve">  MAIN_FILE = 'streamlit_app.py'</w:t>
+      </w:r>
+    </w:p>
+    <w:p>
+      <w:pPr>
+        <w:spacing w:before="0" w:after="0"/>
+        <w:shd w:val="clear" w:color="auto" w:fill="EFEFEF"/>
+      </w:pPr>
+      <w:r>
+        <w:rPr>
+          <w:rFonts w:ascii="Consolas" w:hAnsi="Consolas"/>
+          <w:sz w:val="18"/>
+        </w:rPr>
+        <w:t xml:space="preserve">  QUERY_WAREHOUSE = ABT_BUY_WH</w:t>
+      </w:r>
+    </w:p>
+    <w:p>
+      <w:pPr>
+        <w:spacing w:before="0" w:after="0"/>
+        <w:shd w:val="clear" w:color="auto" w:fill="EFEFEF"/>
+      </w:pPr>
+      <w:r>
+        <w:rPr>
+          <w:rFonts w:ascii="Consolas" w:hAnsi="Consolas"/>
+          <w:sz w:val="18"/>
+        </w:rPr>
+        <w:t xml:space="preserve">  TITLE = 'Abt-Buy Product Matching Dashboard';</w:t>
+      </w:r>
+    </w:p>
+    <w:p>
+      <w:pPr>
+        <w:spacing w:before="0" w:after="120"/>
+      </w:pPr>
+    </w:p>
+    <w:p>
+      <w:r>
+        <w:rPr>
+          <w:b/>
+        </w:rPr>
+        <w:t>Step 9.5 — Open it.</w:t>
+      </w:r>
+      <w:r>
+        <w:rPr>
+          <w:b w:val="0"/>
+        </w:rPr>
+        <w:t xml:space="preserve"> Snowsight → </w:t>
+      </w:r>
+      <w:r>
+        <w:rPr>
+          <w:b/>
+        </w:rPr>
         <w:t>Projects</w:t>
       </w:r>
       <w:r>
@@ -13862,6 +14879,18 @@
         <w:rPr>
           <w:b w:val="0"/>
         </w:rPr>
+        <w:t xml:space="preserve"> → click </w:t>
+      </w:r>
+      <w:r>
+        <w:rPr>
+          <w:b/>
+        </w:rPr>
+        <w:t>`ABT_BUY_DASHBOARD`</w:t>
+      </w:r>
+      <w:r>
+        <w:rPr>
+          <w:b w:val="0"/>
+        </w:rPr>
         <w:t>.</w:t>
       </w:r>
     </w:p>
@@ -13870,18 +14899,188 @@
         <w:rPr>
           <w:b/>
         </w:rPr>
-        <w:t>Step 9.2</w:t>
+        <w:t>Expected result:</w:t>
       </w:r>
       <w:r>
         <w:rPr>
           <w:b w:val="0"/>
         </w:rPr>
-        <w:t xml:space="preserve"> — Click the </w:t>
-      </w:r>
+        <w:t xml:space="preserve"> a working dashboard with 3 pages (Matching Accuracy / Competitive Pricing / Market Trends) in the sidebar navigation, plus 3 metric tiles on the landing page (confirmed matches / review queue / F1 score) matching your real measured numbers.</w:t>
+      </w:r>
+    </w:p>
+    <w:p>
       <w:r>
         <w:rPr>
           <w:b/>
         </w:rPr>
+        <w:t>Common error → fix:</w:t>
+      </w:r>
+    </w:p>
+    <w:p>
+      <w:pPr>
+        <w:pStyle w:val="ListBullet"/>
+      </w:pPr>
+      <w:r>
+        <w:rPr>
+          <w:b w:val="0"/>
+        </w:rPr>
+        <w:t xml:space="preserve">*"Insufficient privileges to operate on table/view X... owner role ACCOUNTADMIN must have SELECT granted"* → you skipped or need to re-run Step 9.1's grants (they need to cover every table/view the app queries, including ones added later — that's what the </w:t>
+      </w:r>
+      <w:r>
+        <w:rPr>
+          <w:rFonts w:ascii="Consolas" w:hAnsi="Consolas"/>
+          <w:sz w:val="20"/>
+        </w:rPr>
+        <w:t>FUTURE</w:t>
+      </w:r>
+      <w:r>
+        <w:rPr>
+          <w:b w:val="0"/>
+        </w:rPr>
+        <w:t xml:space="preserve"> grants are for).</w:t>
+      </w:r>
+    </w:p>
+    <w:p>
+      <w:pPr>
+        <w:pStyle w:val="ListBullet"/>
+      </w:pPr>
+      <w:r>
+        <w:rPr>
+          <w:b w:val="0"/>
+        </w:rPr>
+        <w:t xml:space="preserve">*Streamlit pages don't show up* → confirm </w:t>
+      </w:r>
+      <w:r>
+        <w:rPr>
+          <w:rFonts w:ascii="Consolas" w:hAnsi="Consolas"/>
+          <w:sz w:val="20"/>
+        </w:rPr>
+        <w:t>streamlit/pages/</w:t>
+      </w:r>
+      <w:r>
+        <w:rPr>
+          <w:b w:val="0"/>
+        </w:rPr>
+        <w:t xml:space="preserve"> in your repo has the three numbered </w:t>
+      </w:r>
+      <w:r>
+        <w:rPr>
+          <w:rFonts w:ascii="Consolas" w:hAnsi="Consolas"/>
+          <w:sz w:val="20"/>
+        </w:rPr>
+        <w:t>.py</w:t>
+      </w:r>
+      <w:r>
+        <w:rPr>
+          <w:b w:val="0"/>
+        </w:rPr>
+        <w:t xml:space="preserve"> files, and </w:t>
+      </w:r>
+      <w:r>
+        <w:rPr>
+          <w:rFonts w:ascii="Consolas" w:hAnsi="Consolas"/>
+          <w:sz w:val="20"/>
+        </w:rPr>
+        <w:t>streamlit/environment.yml</w:t>
+      </w:r>
+      <w:r>
+        <w:rPr>
+          <w:b w:val="0"/>
+        </w:rPr>
+        <w:t xml:space="preserve"> lists </w:t>
+      </w:r>
+      <w:r>
+        <w:rPr>
+          <w:rFonts w:ascii="Consolas" w:hAnsi="Consolas"/>
+          <w:sz w:val="20"/>
+        </w:rPr>
+        <w:t>streamlit</w:t>
+      </w:r>
+      <w:r>
+        <w:rPr>
+          <w:b w:val="0"/>
+        </w:rPr>
+        <w:t xml:space="preserve">, </w:t>
+      </w:r>
+      <w:r>
+        <w:rPr>
+          <w:rFonts w:ascii="Consolas" w:hAnsi="Consolas"/>
+          <w:sz w:val="20"/>
+        </w:rPr>
+        <w:t>pandas</w:t>
+      </w:r>
+      <w:r>
+        <w:rPr>
+          <w:b w:val="0"/>
+        </w:rPr>
+        <w:t xml:space="preserve">, </w:t>
+      </w:r>
+      <w:r>
+        <w:rPr>
+          <w:rFonts w:ascii="Consolas" w:hAnsi="Consolas"/>
+          <w:sz w:val="20"/>
+        </w:rPr>
+        <w:t>snowflake-snowpark-python</w:t>
+      </w:r>
+      <w:r>
+        <w:rPr>
+          <w:b w:val="0"/>
+        </w:rPr>
+        <w:t>.</w:t>
+      </w:r>
+    </w:p>
+    <w:p>
+      <w:pPr>
+        <w:pStyle w:val="ListBullet"/>
+      </w:pPr>
+      <w:r>
+        <w:rPr>
+          <w:b w:val="0"/>
+        </w:rPr>
+        <w:t>*If you go the UI wizard route instead of this SQL path* and hit "Object '...' already exists" on a repeat attempt, that's almost always the git repository object from a previous attempt — don't recreate it, select the existing one from the file browser instead.</w:t>
+      </w:r>
+    </w:p>
+    <w:p>
+      <w:r>
+        <w:rPr>
+          <w:b/>
+        </w:rPr>
+        <w:t>Prefer the UI instead?</w:t>
+      </w:r>
+      <w:r>
+        <w:rPr>
+          <w:b w:val="0"/>
+        </w:rPr>
+        <w:t xml:space="preserve"> It's Snowsight → </w:t>
+      </w:r>
+      <w:r>
+        <w:rPr>
+          <w:b/>
+        </w:rPr>
+        <w:t>Projects</w:t>
+      </w:r>
+      <w:r>
+        <w:rPr>
+          <w:b w:val="0"/>
+        </w:rPr>
+        <w:t xml:space="preserve"> → </w:t>
+      </w:r>
+      <w:r>
+        <w:rPr>
+          <w:b/>
+        </w:rPr>
+        <w:t>Streamlit</w:t>
+      </w:r>
+      <w:r>
+        <w:rPr>
+          <w:b w:val="0"/>
+        </w:rPr>
+        <w:t xml:space="preserve"> → </w:t>
+      </w:r>
+      <w:r>
+        <w:rPr>
+          <w:b/>
+        </w:rPr>
         <w:t>+ Streamlit</w:t>
       </w:r>
       <w:r>
@@ -13900,193 +15099,83 @@
         <w:rPr>
           <w:b w:val="0"/>
         </w:rPr>
-        <w:t xml:space="preserve"> (exact wording may vary slightly by Snowsight version).</w:t>
-      </w:r>
-    </w:p>
-    <w:p>
+        <w:t xml:space="preserve"> → connect GitHub → select the repo → pick </w:t>
+      </w:r>
+      <w:r>
+        <w:rPr>
+          <w:rFonts w:ascii="Consolas" w:hAnsi="Consolas"/>
+          <w:sz w:val="20"/>
+        </w:rPr>
+        <w:t>streamlit/streamlit_app.py</w:t>
+      </w:r>
+      <w:r>
+        <w:rPr>
+          <w:b w:val="0"/>
+        </w:rPr>
+        <w:t xml:space="preserve"> → choose database </w:t>
+      </w:r>
+      <w:r>
+        <w:rPr>
+          <w:rFonts w:ascii="Consolas" w:hAnsi="Consolas"/>
+          <w:sz w:val="20"/>
+        </w:rPr>
+        <w:t>ABT_BUY</w:t>
+      </w:r>
+      <w:r>
+        <w:rPr>
+          <w:b w:val="0"/>
+        </w:rPr>
+        <w:t xml:space="preserve"> / schema </w:t>
+      </w:r>
+      <w:r>
+        <w:rPr>
+          <w:rFonts w:ascii="Consolas" w:hAnsi="Consolas"/>
+          <w:sz w:val="20"/>
+        </w:rPr>
+        <w:t>PUBLIC</w:t>
+      </w:r>
+      <w:r>
+        <w:rPr>
+          <w:b w:val="0"/>
+        </w:rPr>
+        <w:t xml:space="preserve"> → </w:t>
+      </w:r>
       <w:r>
         <w:rPr>
           <w:b/>
         </w:rPr>
-        <w:t>Step 9.3</w:t>
+        <w:t>"Run on warehouse"</w:t>
       </w:r>
       <w:r>
         <w:rPr>
           <w:b w:val="0"/>
         </w:rPr>
-        <w:t xml:space="preserve"> — Connect your GitHub account/repo when prompted (you'll do Part 10 first so this repo exists).</w:t>
-      </w:r>
-    </w:p>
-    <w:p>
+        <w:t xml:space="preserve"> (not "Run on container") → warehouse </w:t>
+      </w:r>
+      <w:r>
+        <w:rPr>
+          <w:rFonts w:ascii="Consolas" w:hAnsi="Consolas"/>
+          <w:sz w:val="20"/>
+        </w:rPr>
+        <w:t>ABT_BUY_WH</w:t>
+      </w:r>
+      <w:r>
+        <w:rPr>
+          <w:b w:val="0"/>
+        </w:rPr>
+        <w:t xml:space="preserve"> → </w:t>
+      </w:r>
       <w:r>
         <w:rPr>
           <w:b/>
         </w:rPr>
-        <w:t>Step 9.4</w:t>
+        <w:t>Create</w:t>
       </w:r>
       <w:r>
         <w:rPr>
           <w:b w:val="0"/>
         </w:rPr>
-        <w:t xml:space="preserve"> — Point it at </w:t>
-      </w:r>
-      <w:r>
-        <w:rPr>
-          <w:rFonts w:ascii="Consolas" w:hAnsi="Consolas"/>
-          <w:sz w:val="20"/>
-        </w:rPr>
-        <w:t>streamlit/streamlit_app.py</w:t>
-      </w:r>
-      <w:r>
-        <w:rPr>
-          <w:b w:val="0"/>
-        </w:rPr>
-        <w:t xml:space="preserve"> as the main file, and set the warehouse to </w:t>
-      </w:r>
-      <w:r>
-        <w:rPr>
-          <w:rFonts w:ascii="Consolas" w:hAnsi="Consolas"/>
-          <w:sz w:val="20"/>
-        </w:rPr>
-        <w:t>ABT_BUY_WH</w:t>
-      </w:r>
-      <w:r>
-        <w:rPr>
-          <w:b w:val="0"/>
-        </w:rPr>
-        <w:t>.</w:t>
-      </w:r>
-    </w:p>
-    <w:p>
-      <w:r>
-        <w:rPr>
-          <w:b/>
-        </w:rPr>
-        <w:t>Step 9.5</w:t>
-      </w:r>
-      <w:r>
-        <w:rPr>
-          <w:b w:val="0"/>
-        </w:rPr>
-        <w:t xml:space="preserve"> — Click </w:t>
-      </w:r>
-      <w:r>
-        <w:rPr>
-          <w:b/>
-        </w:rPr>
-        <w:t>Create</w:t>
-      </w:r>
-      <w:r>
-        <w:rPr>
-          <w:b w:val="0"/>
-        </w:rPr>
-        <w:t>. Snowsight opens the running app.</w:t>
-      </w:r>
-    </w:p>
-    <w:p>
-      <w:r>
-        <w:rPr>
-          <w:b/>
-        </w:rPr>
-        <w:t>Expected result:</w:t>
-      </w:r>
-      <w:r>
-        <w:rPr>
-          <w:b w:val="0"/>
-        </w:rPr>
-        <w:t xml:space="preserve"> a working dashboard with 3 pages (Matching Accuracy / Competitive Pricing / Market Trends) in the sidebar navigation.</w:t>
-      </w:r>
-    </w:p>
-    <w:p>
-      <w:r>
-        <w:rPr>
-          <w:b/>
-        </w:rPr>
-        <w:t>Common error → fix:</w:t>
-      </w:r>
-      <w:r>
-        <w:rPr>
-          <w:b w:val="0"/>
-        </w:rPr>
-        <w:t xml:space="preserve"> if it can't find the pages, confirm </w:t>
-      </w:r>
-      <w:r>
-        <w:rPr>
-          <w:rFonts w:ascii="Consolas" w:hAnsi="Consolas"/>
-          <w:sz w:val="20"/>
-        </w:rPr>
-        <w:t>streamlit/pages/</w:t>
-      </w:r>
-      <w:r>
-        <w:rPr>
-          <w:b w:val="0"/>
-        </w:rPr>
-        <w:t xml:space="preserve"> contains the three numbered </w:t>
-      </w:r>
-      <w:r>
-        <w:rPr>
-          <w:rFonts w:ascii="Consolas" w:hAnsi="Consolas"/>
-          <w:sz w:val="20"/>
-        </w:rPr>
-        <w:t>.py</w:t>
-      </w:r>
-      <w:r>
-        <w:rPr>
-          <w:b w:val="0"/>
-        </w:rPr>
-        <w:t xml:space="preserve"> files and </w:t>
-      </w:r>
-      <w:r>
-        <w:rPr>
-          <w:rFonts w:ascii="Consolas" w:hAnsi="Consolas"/>
-          <w:sz w:val="20"/>
-        </w:rPr>
-        <w:t>streamlit/environment.yml</w:t>
-      </w:r>
-      <w:r>
-        <w:rPr>
-          <w:b w:val="0"/>
-        </w:rPr>
-        <w:t xml:space="preserve"> lists </w:t>
-      </w:r>
-      <w:r>
-        <w:rPr>
-          <w:rFonts w:ascii="Consolas" w:hAnsi="Consolas"/>
-          <w:sz w:val="20"/>
-        </w:rPr>
-        <w:t>streamlit</w:t>
-      </w:r>
-      <w:r>
-        <w:rPr>
-          <w:b w:val="0"/>
-        </w:rPr>
-        <w:t xml:space="preserve">, </w:t>
-      </w:r>
-      <w:r>
-        <w:rPr>
-          <w:rFonts w:ascii="Consolas" w:hAnsi="Consolas"/>
-          <w:sz w:val="20"/>
-        </w:rPr>
-        <w:t>pandas</w:t>
-      </w:r>
-      <w:r>
-        <w:rPr>
-          <w:b w:val="0"/>
-        </w:rPr>
-        <w:t xml:space="preserve">, </w:t>
-      </w:r>
-      <w:r>
-        <w:rPr>
-          <w:rFonts w:ascii="Consolas" w:hAnsi="Consolas"/>
-          <w:sz w:val="20"/>
-        </w:rPr>
-        <w:t>snowflake-snowpark-python</w:t>
-      </w:r>
-      <w:r>
-        <w:rPr>
-          <w:b w:val="0"/>
-        </w:rPr>
-        <w:t>.</w:t>
+        <w:t>. Just expect to possibly hit the same privilege gaps covered in Step 9.1 along the way.</w:t>
       </w:r>
     </w:p>
     <w:p>
@@ -15477,6 +16566,534 @@
                 <w:b w:val="0"/>
               </w:rPr>
               <w:t>The specific line shows green/success on its own</w:t>
+            </w:r>
+          </w:p>
+        </w:tc>
+      </w:tr>
+      <w:tr>
+        <w:tc>
+          <w:tcPr>
+            <w:tcW w:type="dxa" w:w="2160"/>
+          </w:tcPr>
+          <w:p>
+            <w:r/>
+            <w:r>
+              <w:rPr>
+                <w:rFonts w:ascii="Consolas" w:hAnsi="Consolas"/>
+                <w:sz w:val="20"/>
+              </w:rPr>
+              <w:t>Unknown tool type</w:t>
+            </w:r>
+            <w:r>
+              <w:rPr>
+                <w:b w:val="0"/>
+              </w:rPr>
+              <w:t xml:space="preserve"> / </w:t>
+            </w:r>
+            <w:r>
+              <w:rPr>
+                <w:rFonts w:ascii="Consolas" w:hAnsi="Consolas"/>
+                <w:sz w:val="20"/>
+              </w:rPr>
+              <w:t>"spec is invalid: null"</w:t>
+            </w:r>
+            <w:r>
+              <w:rPr>
+                <w:b w:val="0"/>
+              </w:rPr>
+              <w:t xml:space="preserve"> on </w:t>
+            </w:r>
+            <w:r>
+              <w:rPr>
+                <w:rFonts w:ascii="Consolas" w:hAnsi="Consolas"/>
+                <w:sz w:val="20"/>
+              </w:rPr>
+              <w:t>CREATE MCP SERVER</w:t>
+            </w:r>
+          </w:p>
+        </w:tc>
+        <w:tc>
+          <w:tcPr>
+            <w:tcW w:type="dxa" w:w="2160"/>
+          </w:tcPr>
+          <w:p>
+            <w:r/>
+            <w:r>
+              <w:rPr>
+                <w:b w:val="0"/>
+              </w:rPr>
+              <w:t>MCP tool types use a different, uppercase enum (</w:t>
+            </w:r>
+            <w:r>
+              <w:rPr>
+                <w:rFonts w:ascii="Consolas" w:hAnsi="Consolas"/>
+                <w:sz w:val="20"/>
+              </w:rPr>
+              <w:t>CORTEX_ANALYST_MESSAGE</w:t>
+            </w:r>
+            <w:r>
+              <w:rPr>
+                <w:b w:val="0"/>
+              </w:rPr>
+              <w:t xml:space="preserve">, </w:t>
+            </w:r>
+            <w:r>
+              <w:rPr>
+                <w:rFonts w:ascii="Consolas" w:hAnsi="Consolas"/>
+                <w:sz w:val="20"/>
+              </w:rPr>
+              <w:t>CORTEX_SEARCH_SERVICE_QUERY</w:t>
+            </w:r>
+            <w:r>
+              <w:rPr>
+                <w:b w:val="0"/>
+              </w:rPr>
+              <w:t xml:space="preserve">, </w:t>
+            </w:r>
+            <w:r>
+              <w:rPr>
+                <w:rFonts w:ascii="Consolas" w:hAnsi="Consolas"/>
+                <w:sz w:val="20"/>
+              </w:rPr>
+              <w:t>SYSTEM_EXECUTE_SQL</w:t>
+            </w:r>
+            <w:r>
+              <w:rPr>
+                <w:b w:val="0"/>
+              </w:rPr>
+              <w:t xml:space="preserve">) than </w:t>
+            </w:r>
+            <w:r>
+              <w:rPr>
+                <w:rFonts w:ascii="Consolas" w:hAnsi="Consolas"/>
+                <w:sz w:val="20"/>
+              </w:rPr>
+              <w:t>CREATE AGENT</w:t>
+            </w:r>
+            <w:r>
+              <w:rPr>
+                <w:b w:val="0"/>
+              </w:rPr>
+              <w:t xml:space="preserve">'s lowercase ones, and every tool also needs </w:t>
+            </w:r>
+            <w:r>
+              <w:rPr>
+                <w:rFonts w:ascii="Consolas" w:hAnsi="Consolas"/>
+                <w:sz w:val="20"/>
+              </w:rPr>
+              <w:t>title</w:t>
+            </w:r>
+            <w:r>
+              <w:rPr>
+                <w:b w:val="0"/>
+              </w:rPr>
+              <w:t>+</w:t>
+            </w:r>
+            <w:r>
+              <w:rPr>
+                <w:rFonts w:ascii="Consolas" w:hAnsi="Consolas"/>
+                <w:sz w:val="20"/>
+              </w:rPr>
+              <w:t>description</w:t>
+            </w:r>
+            <w:r>
+              <w:rPr>
+                <w:b w:val="0"/>
+              </w:rPr>
+              <w:t xml:space="preserve"> plus a single </w:t>
+            </w:r>
+            <w:r>
+              <w:rPr>
+                <w:rFonts w:ascii="Consolas" w:hAnsi="Consolas"/>
+                <w:sz w:val="20"/>
+              </w:rPr>
+              <w:t>identifier</w:t>
+            </w:r>
+            <w:r>
+              <w:rPr>
+                <w:b w:val="0"/>
+              </w:rPr>
+              <w:t xml:space="preserve"> (not </w:t>
+            </w:r>
+            <w:r>
+              <w:rPr>
+                <w:rFonts w:ascii="Consolas" w:hAnsi="Consolas"/>
+                <w:sz w:val="20"/>
+              </w:rPr>
+              <w:t>semantic_view</w:t>
+            </w:r>
+            <w:r>
+              <w:rPr>
+                <w:b w:val="0"/>
+              </w:rPr>
+              <w:t>/</w:t>
+            </w:r>
+            <w:r>
+              <w:rPr>
+                <w:rFonts w:ascii="Consolas" w:hAnsi="Consolas"/>
+                <w:sz w:val="20"/>
+              </w:rPr>
+              <w:t>search_service</w:t>
+            </w:r>
+            <w:r>
+              <w:rPr>
+                <w:b w:val="0"/>
+              </w:rPr>
+              <w:t xml:space="preserve"> keys)</w:t>
+            </w:r>
+          </w:p>
+        </w:tc>
+        <w:tc>
+          <w:tcPr>
+            <w:tcW w:type="dxa" w:w="2160"/>
+          </w:tcPr>
+          <w:p>
+            <w:r/>
+            <w:r>
+              <w:rPr>
+                <w:b w:val="0"/>
+              </w:rPr>
+              <w:t xml:space="preserve">Use the exact spec in Part 8 — don't reuse </w:t>
+            </w:r>
+            <w:r>
+              <w:rPr>
+                <w:rFonts w:ascii="Consolas" w:hAnsi="Consolas"/>
+                <w:sz w:val="20"/>
+              </w:rPr>
+              <w:t>CREATE AGENT</w:t>
+            </w:r>
+            <w:r>
+              <w:rPr>
+                <w:b w:val="0"/>
+              </w:rPr>
+              <w:t xml:space="preserve"> tool syntax for MCP servers</w:t>
+            </w:r>
+          </w:p>
+        </w:tc>
+        <w:tc>
+          <w:tcPr>
+            <w:tcW w:type="dxa" w:w="2160"/>
+          </w:tcPr>
+          <w:p>
+            <w:r/>
+            <w:r>
+              <w:rPr>
+                <w:b w:val="0"/>
+              </w:rPr>
+              <w:t xml:space="preserve">Server creates cleanly, </w:t>
+            </w:r>
+            <w:r>
+              <w:rPr>
+                <w:rFonts w:ascii="Consolas" w:hAnsi="Consolas"/>
+                <w:sz w:val="20"/>
+              </w:rPr>
+              <w:t>SHOW MCP SERVERS</w:t>
+            </w:r>
+            <w:r>
+              <w:rPr>
+                <w:b w:val="0"/>
+              </w:rPr>
+              <w:t xml:space="preserve"> returns it</w:t>
+            </w:r>
+          </w:p>
+        </w:tc>
+      </w:tr>
+      <w:tr>
+        <w:tc>
+          <w:tcPr>
+            <w:tcW w:type="dxa" w:w="2160"/>
+          </w:tcPr>
+          <w:p>
+            <w:r/>
+            <w:r>
+              <w:rPr>
+                <w:b w:val="0"/>
+              </w:rPr>
+              <w:t xml:space="preserve">Any </w:t>
+            </w:r>
+            <w:r>
+              <w:rPr>
+                <w:rFonts w:ascii="Consolas" w:hAnsi="Consolas"/>
+                <w:sz w:val="20"/>
+              </w:rPr>
+              <w:t>"Insufficient privileges... role ACCOUNTADMIN must have X granted"</w:t>
+            </w:r>
+            <w:r>
+              <w:rPr>
+                <w:b w:val="0"/>
+              </w:rPr>
+              <w:t xml:space="preserve"> while using a Snowsight UI wizard (git repo connect, Streamlit creation, etc.)</w:t>
+            </w:r>
+          </w:p>
+        </w:tc>
+        <w:tc>
+          <w:tcPr>
+            <w:tcW w:type="dxa" w:w="2160"/>
+          </w:tcPr>
+          <w:p>
+            <w:r/>
+            <w:r>
+              <w:rPr>
+                <w:b w:val="0"/>
+              </w:rPr>
+              <w:t xml:space="preserve">Several Snowsight UI actions run as </w:t>
+            </w:r>
+            <w:r>
+              <w:rPr>
+                <w:rFonts w:ascii="Consolas" w:hAnsi="Consolas"/>
+                <w:sz w:val="20"/>
+              </w:rPr>
+              <w:t>ACCOUNTADMIN</w:t>
+            </w:r>
+            <w:r>
+              <w:rPr>
+                <w:b w:val="0"/>
+              </w:rPr>
+              <w:t xml:space="preserve"> regardless of your active role, and </w:t>
+            </w:r>
+            <w:r>
+              <w:rPr>
+                <w:rFonts w:ascii="Consolas" w:hAnsi="Consolas"/>
+                <w:sz w:val="20"/>
+              </w:rPr>
+              <w:t>ACCOUNTADMIN</w:t>
+            </w:r>
+            <w:r>
+              <w:rPr>
+                <w:b w:val="0"/>
+              </w:rPr>
+              <w:t xml:space="preserve"> has no automatic rights on objects owned by </w:t>
+            </w:r>
+            <w:r>
+              <w:rPr>
+                <w:rFonts w:ascii="Consolas" w:hAnsi="Consolas"/>
+                <w:sz w:val="20"/>
+              </w:rPr>
+              <w:t>ABT_BUY_ROLE</w:t>
+            </w:r>
+          </w:p>
+        </w:tc>
+        <w:tc>
+          <w:tcPr>
+            <w:tcW w:type="dxa" w:w="2160"/>
+          </w:tcPr>
+          <w:p>
+            <w:r/>
+            <w:r>
+              <w:rPr>
+                <w:rFonts w:ascii="Consolas" w:hAnsi="Consolas"/>
+                <w:sz w:val="20"/>
+              </w:rPr>
+              <w:t>GRANT</w:t>
+            </w:r>
+            <w:r>
+              <w:rPr>
+                <w:b w:val="0"/>
+              </w:rPr>
+              <w:t xml:space="preserve"> the specific privilege named in the error </w:t>
+            </w:r>
+            <w:r>
+              <w:rPr>
+                <w:rFonts w:ascii="Consolas" w:hAnsi="Consolas"/>
+                <w:sz w:val="20"/>
+              </w:rPr>
+              <w:t>... TO ROLE ACCOUNTADMIN</w:t>
+            </w:r>
+            <w:r>
+              <w:rPr>
+                <w:b w:val="0"/>
+              </w:rPr>
+              <w:t xml:space="preserve"> (not </w:t>
+            </w:r>
+            <w:r>
+              <w:rPr>
+                <w:rFonts w:ascii="Consolas" w:hAnsi="Consolas"/>
+                <w:sz w:val="20"/>
+              </w:rPr>
+              <w:t>ABT_BUY_ROLE</w:t>
+            </w:r>
+            <w:r>
+              <w:rPr>
+                <w:b w:val="0"/>
+              </w:rPr>
+              <w:t>)</w:t>
+            </w:r>
+          </w:p>
+        </w:tc>
+        <w:tc>
+          <w:tcPr>
+            <w:tcW w:type="dxa" w:w="2160"/>
+          </w:tcPr>
+          <w:p>
+            <w:r/>
+            <w:r>
+              <w:rPr>
+                <w:b w:val="0"/>
+              </w:rPr>
+              <w:t>Retry the same UI action</w:t>
+            </w:r>
+          </w:p>
+        </w:tc>
+      </w:tr>
+      <w:tr>
+        <w:tc>
+          <w:tcPr>
+            <w:tcW w:type="dxa" w:w="2160"/>
+          </w:tcPr>
+          <w:p>
+            <w:r/>
+            <w:r>
+              <w:rPr>
+                <w:rFonts w:ascii="Consolas" w:hAnsi="Consolas"/>
+                <w:sz w:val="20"/>
+              </w:rPr>
+              <w:t>"Location '...' is not allowed by integration"</w:t>
+            </w:r>
+            <w:r>
+              <w:rPr>
+                <w:b w:val="0"/>
+              </w:rPr>
+              <w:t xml:space="preserve"> when connecting a git repository</w:t>
+            </w:r>
+          </w:p>
+        </w:tc>
+        <w:tc>
+          <w:tcPr>
+            <w:tcW w:type="dxa" w:w="2160"/>
+          </w:tcPr>
+          <w:p>
+            <w:r/>
+            <w:r>
+              <w:rPr>
+                <w:b w:val="0"/>
+              </w:rPr>
+              <w:t xml:space="preserve">The API integration's </w:t>
+            </w:r>
+            <w:r>
+              <w:rPr>
+                <w:rFonts w:ascii="Consolas" w:hAnsi="Consolas"/>
+                <w:sz w:val="20"/>
+              </w:rPr>
+              <w:t>API_ALLOWED_PREFIXES</w:t>
+            </w:r>
+            <w:r>
+              <w:rPr>
+                <w:b w:val="0"/>
+              </w:rPr>
+              <w:t xml:space="preserve"> didn't include a trailing slash, and Snowflake's prefix match wants a clean path boundary (not just a raw string prefix) — the appended </w:t>
+            </w:r>
+            <w:r>
+              <w:rPr>
+                <w:rFonts w:ascii="Consolas" w:hAnsi="Consolas"/>
+                <w:sz w:val="20"/>
+              </w:rPr>
+              <w:t>.git</w:t>
+            </w:r>
+            <w:r>
+              <w:rPr>
+                <w:b w:val="0"/>
+              </w:rPr>
+              <w:t xml:space="preserve"> breaks a prefix that ends exactly at the repo name</w:t>
+            </w:r>
+          </w:p>
+        </w:tc>
+        <w:tc>
+          <w:tcPr>
+            <w:tcW w:type="dxa" w:w="2160"/>
+          </w:tcPr>
+          <w:p>
+            <w:r/>
+            <w:r>
+              <w:rPr>
+                <w:rFonts w:ascii="Consolas" w:hAnsi="Consolas"/>
+                <w:sz w:val="20"/>
+              </w:rPr>
+              <w:t>ALTER API INTEGRATION &lt;name&gt; SET API_ALLOWED_PREFIXES = ('https://github.com/&lt;username&gt;/')</w:t>
+            </w:r>
+            <w:r>
+              <w:rPr>
+                <w:b w:val="0"/>
+              </w:rPr>
+              <w:t xml:space="preserve"> (trailing slash, whole namespace)</w:t>
+            </w:r>
+          </w:p>
+        </w:tc>
+        <w:tc>
+          <w:tcPr>
+            <w:tcW w:type="dxa" w:w="2160"/>
+          </w:tcPr>
+          <w:p>
+            <w:r/>
+            <w:r>
+              <w:rPr>
+                <w:b w:val="0"/>
+              </w:rPr>
+              <w:t>Retry the git repository connection</w:t>
+            </w:r>
+          </w:p>
+        </w:tc>
+      </w:tr>
+      <w:tr>
+        <w:tc>
+          <w:tcPr>
+            <w:tcW w:type="dxa" w:w="2160"/>
+          </w:tcPr>
+          <w:p>
+            <w:r/>
+            <w:r>
+              <w:rPr>
+                <w:rFonts w:ascii="Consolas" w:hAnsi="Consolas"/>
+                <w:sz w:val="20"/>
+              </w:rPr>
+              <w:t>"Object '...' already exists"</w:t>
+            </w:r>
+            <w:r>
+              <w:rPr>
+                <w:b w:val="0"/>
+              </w:rPr>
+              <w:t xml:space="preserve"> when redoing "Create from repository" for Streamlit</w:t>
+            </w:r>
+          </w:p>
+        </w:tc>
+        <w:tc>
+          <w:tcPr>
+            <w:tcW w:type="dxa" w:w="2160"/>
+          </w:tcPr>
+          <w:p>
+            <w:r/>
+            <w:r>
+              <w:rPr>
+                <w:b w:val="0"/>
+              </w:rPr>
+              <w:t>The git repository connection object was already created successfully in an earlier attempt</w:t>
+            </w:r>
+          </w:p>
+        </w:tc>
+        <w:tc>
+          <w:tcPr>
+            <w:tcW w:type="dxa" w:w="2160"/>
+          </w:tcPr>
+          <w:p>
+            <w:r/>
+            <w:r>
+              <w:rPr>
+                <w:b w:val="0"/>
+              </w:rPr>
+              <w:t>Don't recreate it — select the existing repository from the file browser instead of going through "Clone Git Repository" again</w:t>
+            </w:r>
+          </w:p>
+        </w:tc>
+        <w:tc>
+          <w:tcPr>
+            <w:tcW w:type="dxa" w:w="2160"/>
+          </w:tcPr>
+          <w:p>
+            <w:r/>
+            <w:r>
+              <w:rPr>
+                <w:b w:val="0"/>
+              </w:rPr>
+              <w:t>File browser shows your repo without erroring</w:t>
             </w:r>
           </w:p>
         </w:tc>

</xml_diff>

<commit_message>
Consolidate dashboard into one page with tabs; add pie charts, filters, plain-language explanations
Replaces the 3-page sidebar-navigation Streamlit structure with a single
page (st.tabs) so a viewer never loses context switching between
Matching Accuracy / Competitive Pricing / Market Trends. Each tab's
content moved into its own importable module (tab_*.py) rather than
Streamlit's auto-discovered pages/ folder, which would have created a
redundant second navigation alongside the tabs.

Added: a donut_chart() helper and three donuts (match outcome share,
category share, cheaper-vs-pricier split) for at-a-glance reading
alongside the existing bar/line charts; a category filter + product
name search on the Competitive Pricing tab; plain-language captions
throughout (e.g. "right 98% of the time" instead of just "97.9%
precision"); human-readable labels for the raw ALL_CAPS category/trend
enum values. Updated docs (beginner_guide, checkbox_matrix) to match
the new file layout.
</commit_message>
<xml_diff>
--- a/docs/beginner_guide.docx
+++ b/docs/beginner_guide.docx
@@ -14905,7 +14905,7 @@
         <w:rPr>
           <w:b w:val="0"/>
         </w:rPr>
-        <w:t xml:space="preserve"> a working dashboard with 3 pages (Matching Accuracy / Competitive Pricing / Market Trends) in the sidebar navigation, plus 3 metric tiles on the landing page (confirmed matches / review queue / F1 score) matching your real measured numbers.</w:t>
+        <w:t xml:space="preserve"> a single-page dashboard with a hero header (differentiator pills, 4 stat cards, a pipeline flow diagram) and three tabs (Matching Accuracy / Competitive Pricing / Market Trends) — deliberately built as tabs on one page, not separate sidebar pages, so a viewer never loses context switching between them.</w:t>
       </w:r>
     </w:p>
     <w:p>
@@ -14948,39 +14948,78 @@
         <w:rPr>
           <w:b w:val="0"/>
         </w:rPr>
-        <w:t xml:space="preserve">*Streamlit pages don't show up* → confirm </w:t>
+        <w:t xml:space="preserve">*Tabs/charts don't show up* → confirm </w:t>
       </w:r>
       <w:r>
         <w:rPr>
           <w:rFonts w:ascii="Consolas" w:hAnsi="Consolas"/>
           <w:sz w:val="20"/>
         </w:rPr>
-        <w:t>streamlit/pages/</w:t>
+        <w:t>streamlit/theme.py</w:t>
       </w:r>
       <w:r>
         <w:rPr>
           <w:b w:val="0"/>
         </w:rPr>
-        <w:t xml:space="preserve"> in your repo has the three numbered </w:t>
+        <w:t xml:space="preserve">, </w:t>
       </w:r>
       <w:r>
         <w:rPr>
           <w:rFonts w:ascii="Consolas" w:hAnsi="Consolas"/>
           <w:sz w:val="20"/>
         </w:rPr>
-        <w:t>.py</w:t>
+        <w:t>tab_matching_accuracy.py</w:t>
       </w:r>
       <w:r>
         <w:rPr>
           <w:b w:val="0"/>
         </w:rPr>
-        <w:t xml:space="preserve"> files, and </w:t>
+        <w:t xml:space="preserve">, </w:t>
       </w:r>
       <w:r>
         <w:rPr>
           <w:rFonts w:ascii="Consolas" w:hAnsi="Consolas"/>
           <w:sz w:val="20"/>
         </w:rPr>
+        <w:t>tab_competitive_pricing.py</w:t>
+      </w:r>
+      <w:r>
+        <w:rPr>
+          <w:b w:val="0"/>
+        </w:rPr>
+        <w:t xml:space="preserve">, and </w:t>
+      </w:r>
+      <w:r>
+        <w:rPr>
+          <w:rFonts w:ascii="Consolas" w:hAnsi="Consolas"/>
+          <w:sz w:val="20"/>
+        </w:rPr>
+        <w:t>tab_market_trends.py</w:t>
+      </w:r>
+      <w:r>
+        <w:rPr>
+          <w:b w:val="0"/>
+        </w:rPr>
+        <w:t xml:space="preserve"> all exist alongside </w:t>
+      </w:r>
+      <w:r>
+        <w:rPr>
+          <w:rFonts w:ascii="Consolas" w:hAnsi="Consolas"/>
+          <w:sz w:val="20"/>
+        </w:rPr>
+        <w:t>streamlit_app.py</w:t>
+      </w:r>
+      <w:r>
+        <w:rPr>
+          <w:b w:val="0"/>
+        </w:rPr>
+        <w:t xml:space="preserve">, and </w:t>
+      </w:r>
+      <w:r>
+        <w:rPr>
+          <w:rFonts w:ascii="Consolas" w:hAnsi="Consolas"/>
+          <w:sz w:val="20"/>
+        </w:rPr>
         <w:t>streamlit/environment.yml</w:t>
       </w:r>
       <w:r>
@@ -15008,6 +15047,19 @@
           <w:sz w:val="20"/>
         </w:rPr>
         <w:t>pandas</w:t>
+      </w:r>
+      <w:r>
+        <w:rPr>
+          <w:b w:val="0"/>
+        </w:rPr>
+        <w:t xml:space="preserve">, </w:t>
+      </w:r>
+      <w:r>
+        <w:rPr>
+          <w:rFonts w:ascii="Consolas" w:hAnsi="Consolas"/>
+          <w:sz w:val="20"/>
+        </w:rPr>
+        <w:t>altair</w:t>
       </w:r>
       <w:r>
         <w:rPr>
@@ -15682,7 +15734,7 @@
         <w:rPr>
           <w:b w:val="0"/>
         </w:rPr>
-        <w:t>Streamlit app deployed and working (3 pages).</w:t>
+        <w:t>Streamlit app deployed and working (one page, 3 tabs).</w:t>
       </w:r>
     </w:p>
     <w:p>

</xml_diff>